<commit_message>
Add E2E business-flow runner, reports, and flow diagrams in docs.
Includes RpmsE2EFlows for the 15 QA flows plus updated Functional Flows DOCX with visuals.

Co-authored-by: Cursor <cursoragent@cursor.com>
</commit_message>
<xml_diff>
--- a/Docs/RPMS_Functional_Flows.docx
+++ b/Docs/RPMS_Functional_Flows.docx
@@ -27,6 +27,8 @@
           <w:sz w:val="24"/>
         </w:rPr>
         <w:t>Rental Property Management System (.NET 8 WinForms)</w:t>
+        <w:br/>
+        <w:t>Kèm sơ đồ trực quan</w:t>
       </w:r>
     </w:p>
     <w:p>
@@ -39,9 +41,22 @@
           <w:b w:val="0"/>
           <w:sz w:val="22"/>
         </w:rPr>
-        <w:t>Tài liệu mô tả luồng nghiệp vụ theo source code hiện tại</w:t>
+        <w:t>Theo source hiện tại: PendingConfirm, gán Manager sau Active,</w:t>
         <w:br/>
-        <w:t>(bao gồm trạng thái PendingConfirm và điều kiện gán Manager)</w:t>
+        <w:t>thông báo Admin duyệt/từ chối tin tới chủ nhà.</w:t>
+      </w:r>
+    </w:p>
+    <w:p>
+      <w:pPr>
+        <w:pStyle w:val="Heading1"/>
+      </w:pPr>
+      <w:r>
+        <w:rPr>
+          <w:rFonts w:ascii="Times New Roman" w:hAnsi="Times New Roman" w:eastAsia="Times New Roman"/>
+          <w:b/>
+          <w:sz w:val="32"/>
+        </w:rPr>
+        <w:t>Phần A. Sơ đồ trực quan</w:t>
       </w:r>
     </w:p>
     <w:p>
@@ -55,6 +70,543 @@
           <w:i w:val="0"/>
           <w:sz w:val="22"/>
         </w:rPr>
+        <w:t>Các hình dưới đây tóm tắt luồng nghiệp vụ chính. Chi tiết từng bước nằm ở Phần B.</w:t>
+      </w:r>
+    </w:p>
+    <w:p>
+      <w:pPr>
+        <w:pStyle w:val="Heading2"/>
+      </w:pPr>
+      <w:r>
+        <w:rPr>
+          <w:rFonts w:ascii="Times New Roman" w:hAnsi="Times New Roman" w:eastAsia="Times New Roman"/>
+          <w:b/>
+          <w:sz w:val="28"/>
+        </w:rPr>
+        <w:t>A1. Vai trò hệ thống</w:t>
+      </w:r>
+    </w:p>
+    <w:p>
+      <w:pPr>
+        <w:jc w:val="center"/>
+      </w:pPr>
+      <w:r>
+        <w:drawing>
+          <wp:inline xmlns:a="http://schemas.openxmlformats.org/drawingml/2006/main" xmlns:pic="http://schemas.openxmlformats.org/drawingml/2006/picture">
+            <wp:extent cx="5760720" cy="2773069"/>
+            <wp:docPr id="1" name="Picture 1"/>
+            <wp:cNvGraphicFramePr>
+              <a:graphicFrameLocks noChangeAspect="1"/>
+            </wp:cNvGraphicFramePr>
+            <a:graphic>
+              <a:graphicData uri="http://schemas.openxmlformats.org/drawingml/2006/picture">
+                <pic:pic>
+                  <pic:nvPicPr>
+                    <pic:cNvPr id="0" name="01_roles_overview.png"/>
+                    <pic:cNvPicPr/>
+                  </pic:nvPicPr>
+                  <pic:blipFill>
+                    <a:blip r:embed="rId9"/>
+                    <a:stretch>
+                      <a:fillRect/>
+                    </a:stretch>
+                  </pic:blipFill>
+                  <pic:spPr>
+                    <a:xfrm>
+                      <a:off x="0" y="0"/>
+                      <a:ext cx="5760720" cy="2773069"/>
+                    </a:xfrm>
+                    <a:prstGeom prst="rect"/>
+                  </pic:spPr>
+                </pic:pic>
+              </a:graphicData>
+            </a:graphic>
+          </wp:inline>
+        </w:drawing>
+      </w:r>
+    </w:p>
+    <w:p>
+      <w:pPr>
+        <w:spacing w:after="240"/>
+        <w:jc w:val="center"/>
+      </w:pPr>
+      <w:r>
+        <w:rPr>
+          <w:rFonts w:ascii="Times New Roman" w:hAnsi="Times New Roman" w:eastAsia="Times New Roman"/>
+          <w:b w:val="0"/>
+          <w:i/>
+          <w:sz w:val="20"/>
+        </w:rPr>
+        <w:t>Hình 1. Bốn vai trò Admin / Landlord / Tenant / Manager và chức năng chung.</w:t>
+      </w:r>
+    </w:p>
+    <w:p>
+      <w:pPr>
+        <w:pStyle w:val="Heading2"/>
+      </w:pPr>
+      <w:r>
+        <w:rPr>
+          <w:rFonts w:ascii="Times New Roman" w:hAnsi="Times New Roman" w:eastAsia="Times New Roman"/>
+          <w:b/>
+          <w:sz w:val="28"/>
+        </w:rPr>
+        <w:t>A2. Luồng xương sống End-to-end</w:t>
+      </w:r>
+    </w:p>
+    <w:p>
+      <w:pPr>
+        <w:jc w:val="center"/>
+      </w:pPr>
+      <w:r>
+        <w:drawing>
+          <wp:inline xmlns:a="http://schemas.openxmlformats.org/drawingml/2006/main" xmlns:pic="http://schemas.openxmlformats.org/drawingml/2006/picture">
+            <wp:extent cx="5760720" cy="3482962"/>
+            <wp:docPr id="2" name="Picture 2"/>
+            <wp:cNvGraphicFramePr>
+              <a:graphicFrameLocks noChangeAspect="1"/>
+            </wp:cNvGraphicFramePr>
+            <a:graphic>
+              <a:graphicData uri="http://schemas.openxmlformats.org/drawingml/2006/picture">
+                <pic:pic>
+                  <pic:nvPicPr>
+                    <pic:cNvPr id="0" name="02_e2e_flow.png"/>
+                    <pic:cNvPicPr/>
+                  </pic:nvPicPr>
+                  <pic:blipFill>
+                    <a:blip r:embed="rId10"/>
+                    <a:stretch>
+                      <a:fillRect/>
+                    </a:stretch>
+                  </pic:blipFill>
+                  <pic:spPr>
+                    <a:xfrm>
+                      <a:off x="0" y="0"/>
+                      <a:ext cx="5760720" cy="3482962"/>
+                    </a:xfrm>
+                    <a:prstGeom prst="rect"/>
+                  </pic:spPr>
+                </pic:pic>
+              </a:graphicData>
+            </a:graphic>
+          </wp:inline>
+        </w:drawing>
+      </w:r>
+    </w:p>
+    <w:p>
+      <w:pPr>
+        <w:spacing w:after="240"/>
+        <w:jc w:val="center"/>
+      </w:pPr>
+      <w:r>
+        <w:rPr>
+          <w:rFonts w:ascii="Times New Roman" w:hAnsi="Times New Roman" w:eastAsia="Times New Roman"/>
+          <w:b w:val="0"/>
+          <w:i/>
+          <w:sz w:val="20"/>
+        </w:rPr>
+        <w:t>Hình 2. Từ tạo nhà đến vận hành thuê, hóa đơn và sự cố.</w:t>
+      </w:r>
+    </w:p>
+    <w:p>
+      <w:pPr>
+        <w:pStyle w:val="Heading2"/>
+      </w:pPr>
+      <w:r>
+        <w:rPr>
+          <w:rFonts w:ascii="Times New Roman" w:hAnsi="Times New Roman" w:eastAsia="Times New Roman"/>
+          <w:b/>
+          <w:sz w:val="28"/>
+        </w:rPr>
+        <w:t>A3. Trạng thái hợp đồng</w:t>
+      </w:r>
+    </w:p>
+    <w:p>
+      <w:pPr>
+        <w:jc w:val="center"/>
+      </w:pPr>
+      <w:r>
+        <w:drawing>
+          <wp:inline xmlns:a="http://schemas.openxmlformats.org/drawingml/2006/main" xmlns:pic="http://schemas.openxmlformats.org/drawingml/2006/picture">
+            <wp:extent cx="5760720" cy="3433323"/>
+            <wp:docPr id="3" name="Picture 3"/>
+            <wp:cNvGraphicFramePr>
+              <a:graphicFrameLocks noChangeAspect="1"/>
+            </wp:cNvGraphicFramePr>
+            <a:graphic>
+              <a:graphicData uri="http://schemas.openxmlformats.org/drawingml/2006/picture">
+                <pic:pic>
+                  <pic:nvPicPr>
+                    <pic:cNvPr id="0" name="03_contract_states.png"/>
+                    <pic:cNvPicPr/>
+                  </pic:nvPicPr>
+                  <pic:blipFill>
+                    <a:blip r:embed="rId11"/>
+                    <a:stretch>
+                      <a:fillRect/>
+                    </a:stretch>
+                  </pic:blipFill>
+                  <pic:spPr>
+                    <a:xfrm>
+                      <a:off x="0" y="0"/>
+                      <a:ext cx="5760720" cy="3433323"/>
+                    </a:xfrm>
+                    <a:prstGeom prst="rect"/>
+                  </pic:spPr>
+                </pic:pic>
+              </a:graphicData>
+            </a:graphic>
+          </wp:inline>
+        </w:drawing>
+      </w:r>
+    </w:p>
+    <w:p>
+      <w:pPr>
+        <w:spacing w:after="240"/>
+        <w:jc w:val="center"/>
+      </w:pPr>
+      <w:r>
+        <w:rPr>
+          <w:rFonts w:ascii="Times New Roman" w:hAnsi="Times New Roman" w:eastAsia="Times New Roman"/>
+          <w:b w:val="0"/>
+          <w:i/>
+          <w:sz w:val="20"/>
+        </w:rPr>
+        <w:t>Hình 3. Máy trạng thái Draft → PendingConfirm → Active / Terminated / Expired.</w:t>
+      </w:r>
+    </w:p>
+    <w:p>
+      <w:pPr>
+        <w:pStyle w:val="Heading2"/>
+      </w:pPr>
+      <w:r>
+        <w:rPr>
+          <w:rFonts w:ascii="Times New Roman" w:hAnsi="Times New Roman" w:eastAsia="Times New Roman"/>
+          <w:b/>
+          <w:sz w:val="28"/>
+        </w:rPr>
+        <w:t>A4. Duyệt tin đăng</w:t>
+      </w:r>
+    </w:p>
+    <w:p>
+      <w:pPr>
+        <w:jc w:val="center"/>
+      </w:pPr>
+      <w:r>
+        <w:drawing>
+          <wp:inline xmlns:a="http://schemas.openxmlformats.org/drawingml/2006/main" xmlns:pic="http://schemas.openxmlformats.org/drawingml/2006/picture">
+            <wp:extent cx="5760720" cy="2570866"/>
+            <wp:docPr id="4" name="Picture 4"/>
+            <wp:cNvGraphicFramePr>
+              <a:graphicFrameLocks noChangeAspect="1"/>
+            </wp:cNvGraphicFramePr>
+            <a:graphic>
+              <a:graphicData uri="http://schemas.openxmlformats.org/drawingml/2006/picture">
+                <pic:pic>
+                  <pic:nvPicPr>
+                    <pic:cNvPr id="0" name="04_post_approval.png"/>
+                    <pic:cNvPicPr/>
+                  </pic:nvPicPr>
+                  <pic:blipFill>
+                    <a:blip r:embed="rId12"/>
+                    <a:stretch>
+                      <a:fillRect/>
+                    </a:stretch>
+                  </pic:blipFill>
+                  <pic:spPr>
+                    <a:xfrm>
+                      <a:off x="0" y="0"/>
+                      <a:ext cx="5760720" cy="2570866"/>
+                    </a:xfrm>
+                    <a:prstGeom prst="rect"/>
+                  </pic:spPr>
+                </pic:pic>
+              </a:graphicData>
+            </a:graphic>
+          </wp:inline>
+        </w:drawing>
+      </w:r>
+    </w:p>
+    <w:p>
+      <w:pPr>
+        <w:spacing w:after="240"/>
+        <w:jc w:val="center"/>
+      </w:pPr>
+      <w:r>
+        <w:rPr>
+          <w:rFonts w:ascii="Times New Roman" w:hAnsi="Times New Roman" w:eastAsia="Times New Roman"/>
+          <w:b w:val="0"/>
+          <w:i/>
+          <w:sz w:val="20"/>
+        </w:rPr>
+        <w:t>Hình 4. Admin duyệt hoặc từ chối tin và gửi thông báo cho chủ.</w:t>
+      </w:r>
+    </w:p>
+    <w:p>
+      <w:pPr>
+        <w:pStyle w:val="Heading2"/>
+      </w:pPr>
+      <w:r>
+        <w:rPr>
+          <w:rFonts w:ascii="Times New Roman" w:hAnsi="Times New Roman" w:eastAsia="Times New Roman"/>
+          <w:b/>
+          <w:sz w:val="28"/>
+        </w:rPr>
+        <w:t>A5. Khách xác nhận thuê</w:t>
+      </w:r>
+    </w:p>
+    <w:p>
+      <w:pPr>
+        <w:jc w:val="center"/>
+      </w:pPr>
+      <w:r>
+        <w:drawing>
+          <wp:inline xmlns:a="http://schemas.openxmlformats.org/drawingml/2006/main" xmlns:pic="http://schemas.openxmlformats.org/drawingml/2006/picture">
+            <wp:extent cx="5760720" cy="2674030"/>
+            <wp:docPr id="5" name="Picture 5"/>
+            <wp:cNvGraphicFramePr>
+              <a:graphicFrameLocks noChangeAspect="1"/>
+            </wp:cNvGraphicFramePr>
+            <a:graphic>
+              <a:graphicData uri="http://schemas.openxmlformats.org/drawingml/2006/picture">
+                <pic:pic>
+                  <pic:nvPicPr>
+                    <pic:cNvPr id="0" name="05_rental_confirm.png"/>
+                    <pic:cNvPicPr/>
+                  </pic:nvPicPr>
+                  <pic:blipFill>
+                    <a:blip r:embed="rId13"/>
+                    <a:stretch>
+                      <a:fillRect/>
+                    </a:stretch>
+                  </pic:blipFill>
+                  <pic:spPr>
+                    <a:xfrm>
+                      <a:off x="0" y="0"/>
+                      <a:ext cx="5760720" cy="2674030"/>
+                    </a:xfrm>
+                    <a:prstGeom prst="rect"/>
+                  </pic:spPr>
+                </pic:pic>
+              </a:graphicData>
+            </a:graphic>
+          </wp:inline>
+        </w:drawing>
+      </w:r>
+    </w:p>
+    <w:p>
+      <w:pPr>
+        <w:spacing w:after="240"/>
+        <w:jc w:val="center"/>
+      </w:pPr>
+      <w:r>
+        <w:rPr>
+          <w:rFonts w:ascii="Times New Roman" w:hAnsi="Times New Roman" w:eastAsia="Times New Roman"/>
+          <w:b w:val="0"/>
+          <w:i/>
+          <w:sz w:val="20"/>
+        </w:rPr>
+        <w:t>Hình 5. PendingConfirm và nhánh Đồng ý / Từ chối thuê.</w:t>
+      </w:r>
+    </w:p>
+    <w:p>
+      <w:pPr>
+        <w:pStyle w:val="Heading2"/>
+      </w:pPr>
+      <w:r>
+        <w:rPr>
+          <w:rFonts w:ascii="Times New Roman" w:hAnsi="Times New Roman" w:eastAsia="Times New Roman"/>
+          <w:b/>
+          <w:sz w:val="28"/>
+        </w:rPr>
+        <w:t>A6. Gán Manager</w:t>
+      </w:r>
+    </w:p>
+    <w:p>
+      <w:pPr>
+        <w:jc w:val="center"/>
+      </w:pPr>
+      <w:r>
+        <w:drawing>
+          <wp:inline xmlns:a="http://schemas.openxmlformats.org/drawingml/2006/main" xmlns:pic="http://schemas.openxmlformats.org/drawingml/2006/picture">
+            <wp:extent cx="5760720" cy="2467701"/>
+            <wp:docPr id="6" name="Picture 6"/>
+            <wp:cNvGraphicFramePr>
+              <a:graphicFrameLocks noChangeAspect="1"/>
+            </wp:cNvGraphicFramePr>
+            <a:graphic>
+              <a:graphicData uri="http://schemas.openxmlformats.org/drawingml/2006/picture">
+                <pic:pic>
+                  <pic:nvPicPr>
+                    <pic:cNvPr id="0" name="06_manager_gate.png"/>
+                    <pic:cNvPicPr/>
+                  </pic:nvPicPr>
+                  <pic:blipFill>
+                    <a:blip r:embed="rId14"/>
+                    <a:stretch>
+                      <a:fillRect/>
+                    </a:stretch>
+                  </pic:blipFill>
+                  <pic:spPr>
+                    <a:xfrm>
+                      <a:off x="0" y="0"/>
+                      <a:ext cx="5760720" cy="2467701"/>
+                    </a:xfrm>
+                    <a:prstGeom prst="rect"/>
+                  </pic:spPr>
+                </pic:pic>
+              </a:graphicData>
+            </a:graphic>
+          </wp:inline>
+        </w:drawing>
+      </w:r>
+    </w:p>
+    <w:p>
+      <w:pPr>
+        <w:spacing w:after="240"/>
+        <w:jc w:val="center"/>
+      </w:pPr>
+      <w:r>
+        <w:rPr>
+          <w:rFonts w:ascii="Times New Roman" w:hAnsi="Times New Roman" w:eastAsia="Times New Roman"/>
+          <w:b w:val="0"/>
+          <w:i/>
+          <w:sz w:val="20"/>
+        </w:rPr>
+        <w:t>Hình 6. Chỉ gán Manager khi nhà đã có hợp đồng Active.</w:t>
+      </w:r>
+    </w:p>
+    <w:p>
+      <w:pPr>
+        <w:pStyle w:val="Heading2"/>
+      </w:pPr>
+      <w:r>
+        <w:rPr>
+          <w:rFonts w:ascii="Times New Roman" w:hAnsi="Times New Roman" w:eastAsia="Times New Roman"/>
+          <w:b/>
+          <w:sz w:val="28"/>
+        </w:rPr>
+        <w:t>A7. Hóa đơn &amp; sự cố</w:t>
+      </w:r>
+    </w:p>
+    <w:p>
+      <w:pPr>
+        <w:jc w:val="center"/>
+      </w:pPr>
+      <w:r>
+        <w:drawing>
+          <wp:inline xmlns:a="http://schemas.openxmlformats.org/drawingml/2006/main" xmlns:pic="http://schemas.openxmlformats.org/drawingml/2006/picture">
+            <wp:extent cx="5760720" cy="2265498"/>
+            <wp:docPr id="7" name="Picture 7"/>
+            <wp:cNvGraphicFramePr>
+              <a:graphicFrameLocks noChangeAspect="1"/>
+            </wp:cNvGraphicFramePr>
+            <a:graphic>
+              <a:graphicData uri="http://schemas.openxmlformats.org/drawingml/2006/picture">
+                <pic:pic>
+                  <pic:nvPicPr>
+                    <pic:cNvPr id="0" name="07_invoice_maintenance.png"/>
+                    <pic:cNvPicPr/>
+                  </pic:nvPicPr>
+                  <pic:blipFill>
+                    <a:blip r:embed="rId15"/>
+                    <a:stretch>
+                      <a:fillRect/>
+                    </a:stretch>
+                  </pic:blipFill>
+                  <pic:spPr>
+                    <a:xfrm>
+                      <a:off x="0" y="0"/>
+                      <a:ext cx="5760720" cy="2265498"/>
+                    </a:xfrm>
+                    <a:prstGeom prst="rect"/>
+                  </pic:spPr>
+                </pic:pic>
+              </a:graphicData>
+            </a:graphic>
+          </wp:inline>
+        </w:drawing>
+      </w:r>
+    </w:p>
+    <w:p>
+      <w:pPr>
+        <w:spacing w:after="240"/>
+        <w:jc w:val="center"/>
+      </w:pPr>
+      <w:r>
+        <w:rPr>
+          <w:rFonts w:ascii="Times New Roman" w:hAnsi="Times New Roman" w:eastAsia="Times New Roman"/>
+          <w:b w:val="0"/>
+          <w:i/>
+          <w:sz w:val="20"/>
+        </w:rPr>
+        <w:t>Hình 7. Manager ghi chỉ số / xử lý sự cố; khách thanh toán và báo cáo.</w:t>
+      </w:r>
+    </w:p>
+    <w:p>
+      <w:pPr>
+        <w:pStyle w:val="Heading2"/>
+      </w:pPr>
+      <w:r>
+        <w:rPr>
+          <w:rFonts w:ascii="Times New Roman" w:hAnsi="Times New Roman" w:eastAsia="Times New Roman"/>
+          <w:b/>
+          <w:sz w:val="28"/>
+        </w:rPr>
+        <w:t>A8. Thứ tự demo</w:t>
+      </w:r>
+    </w:p>
+    <w:p>
+      <w:pPr>
+        <w:jc w:val="center"/>
+      </w:pPr>
+      <w:r>
+        <w:drawing>
+          <wp:inline xmlns:a="http://schemas.openxmlformats.org/drawingml/2006/main" xmlns:pic="http://schemas.openxmlformats.org/drawingml/2006/picture">
+            <wp:extent cx="5760720" cy="2925752"/>
+            <wp:docPr id="8" name="Picture 8"/>
+            <wp:cNvGraphicFramePr>
+              <a:graphicFrameLocks noChangeAspect="1"/>
+            </wp:cNvGraphicFramePr>
+            <a:graphic>
+              <a:graphicData uri="http://schemas.openxmlformats.org/drawingml/2006/picture">
+                <pic:pic>
+                  <pic:nvPicPr>
+                    <pic:cNvPr id="0" name="08_demo_sequence.png"/>
+                    <pic:cNvPicPr/>
+                  </pic:nvPicPr>
+                  <pic:blipFill>
+                    <a:blip r:embed="rId16"/>
+                    <a:stretch>
+                      <a:fillRect/>
+                    </a:stretch>
+                  </pic:blipFill>
+                  <pic:spPr>
+                    <a:xfrm>
+                      <a:off x="0" y="0"/>
+                      <a:ext cx="5760720" cy="2925752"/>
+                    </a:xfrm>
+                    <a:prstGeom prst="rect"/>
+                  </pic:spPr>
+                </pic:pic>
+              </a:graphicData>
+            </a:graphic>
+          </wp:inline>
+        </w:drawing>
+      </w:r>
+    </w:p>
+    <w:p>
+      <w:pPr>
+        <w:spacing w:after="240"/>
+        <w:jc w:val="center"/>
+      </w:pPr>
+      <w:r>
+        <w:rPr>
+          <w:rFonts w:ascii="Times New Roman" w:hAnsi="Times New Roman" w:eastAsia="Times New Roman"/>
+          <w:b w:val="0"/>
+          <w:i/>
+          <w:sz w:val="20"/>
+        </w:rPr>
+        <w:t>Hình 8. Chuỗi demo khuyến nghị theo từng vai trò.</w:t>
       </w:r>
     </w:p>
     <w:p>
@@ -66,6 +618,19 @@
           <w:rFonts w:ascii="Times New Roman" w:hAnsi="Times New Roman" w:eastAsia="Times New Roman"/>
           <w:b/>
           <w:sz w:val="32"/>
+        </w:rPr>
+        <w:t>Phần B. Mô tả chi tiết luồng</w:t>
+      </w:r>
+    </w:p>
+    <w:p>
+      <w:pPr>
+        <w:pStyle w:val="Heading2"/>
+      </w:pPr>
+      <w:r>
+        <w:rPr>
+          <w:rFonts w:ascii="Times New Roman" w:hAnsi="Times New Roman" w:eastAsia="Times New Roman"/>
+          <w:b/>
+          <w:sz w:val="28"/>
         </w:rPr>
         <w:t>0. Vai trò và đăng nhập</w:t>
       </w:r>
@@ -81,7 +646,7 @@
           <w:i w:val="0"/>
           <w:sz w:val="22"/>
         </w:rPr>
-        <w:t>Người dùng mở ứng dụng → Đăng nhập / Đăng ký → Hệ thống mở MainForm với menu theo RoleID.</w:t>
+        <w:t>Mở app → Login/Register → MainForm theo RoleID.</w:t>
       </w:r>
     </w:p>
     <w:tbl>
@@ -91,14 +656,14 @@
         <w:tblLook w:firstColumn="1" w:firstRow="1" w:lastColumn="0" w:lastRow="0" w:noHBand="0" w:noVBand="1" w:val="04A0"/>
       </w:tblPr>
       <w:tblGrid>
-        <w:gridCol w:w="3230"/>
-        <w:gridCol w:w="3230"/>
-        <w:gridCol w:w="3230"/>
+        <w:gridCol w:w="3249"/>
+        <w:gridCol w:w="3249"/>
+        <w:gridCol w:w="3249"/>
       </w:tblGrid>
       <w:tr>
         <w:tc>
           <w:tcPr>
-            <w:tcW w:type="dxa" w:w="3230"/>
+            <w:tcW w:type="dxa" w:w="3249"/>
           </w:tcPr>
           <w:p>
             <w:r/>
@@ -114,7 +679,7 @@
         </w:tc>
         <w:tc>
           <w:tcPr>
-            <w:tcW w:type="dxa" w:w="3230"/>
+            <w:tcW w:type="dxa" w:w="3249"/>
           </w:tcPr>
           <w:p>
             <w:r/>
@@ -130,7 +695,7 @@
         </w:tc>
         <w:tc>
           <w:tcPr>
-            <w:tcW w:type="dxa" w:w="3230"/>
+            <w:tcW w:type="dxa" w:w="3249"/>
           </w:tcPr>
           <w:p>
             <w:r/>
@@ -148,7 +713,7 @@
       <w:tr>
         <w:tc>
           <w:tcPr>
-            <w:tcW w:type="dxa" w:w="3230"/>
+            <w:tcW w:type="dxa" w:w="3249"/>
           </w:tcPr>
           <w:p>
             <w:r/>
@@ -164,7 +729,7 @@
         </w:tc>
         <w:tc>
           <w:tcPr>
-            <w:tcW w:type="dxa" w:w="3230"/>
+            <w:tcW w:type="dxa" w:w="3249"/>
           </w:tcPr>
           <w:p>
             <w:r/>
@@ -180,7 +745,7 @@
         </w:tc>
         <w:tc>
           <w:tcPr>
-            <w:tcW w:type="dxa" w:w="3230"/>
+            <w:tcW w:type="dxa" w:w="3249"/>
           </w:tcPr>
           <w:p>
             <w:r/>
@@ -190,7 +755,7 @@
                 <w:b w:val="0"/>
                 <w:sz w:val="20"/>
               </w:rPr>
-              <w:t>Duyệt user/tin, quản lý đánh giá, nhật ký, backup, báo cáo</w:t>
+              <w:t>Duyệt user/tin, review, log, backup, báo cáo</w:t>
             </w:r>
           </w:p>
         </w:tc>
@@ -198,7 +763,7 @@
       <w:tr>
         <w:tc>
           <w:tcPr>
-            <w:tcW w:type="dxa" w:w="3230"/>
+            <w:tcW w:type="dxa" w:w="3249"/>
           </w:tcPr>
           <w:p>
             <w:r/>
@@ -214,7 +779,7 @@
         </w:tc>
         <w:tc>
           <w:tcPr>
-            <w:tcW w:type="dxa" w:w="3230"/>
+            <w:tcW w:type="dxa" w:w="3249"/>
           </w:tcPr>
           <w:p>
             <w:r/>
@@ -224,13 +789,13 @@
                 <w:b w:val="0"/>
                 <w:sz w:val="20"/>
               </w:rPr>
-              <w:t>Landlord (Chủ nhà)</w:t>
+              <w:t>Landlord</w:t>
             </w:r>
           </w:p>
         </w:tc>
         <w:tc>
           <w:tcPr>
-            <w:tcW w:type="dxa" w:w="3230"/>
+            <w:tcW w:type="dxa" w:w="3249"/>
           </w:tcPr>
           <w:p>
             <w:r/>
@@ -240,7 +805,7 @@
                 <w:b w:val="0"/>
                 <w:sz w:val="20"/>
               </w:rPr>
-              <w:t>Quản lý nhà/phòng, tin đăng, lịch hẹn, hợp đồng, gán Manager</w:t>
+              <w:t>Nhà/phòng, tin, hẹn, HĐ, gán Manager</w:t>
             </w:r>
           </w:p>
         </w:tc>
@@ -248,7 +813,7 @@
       <w:tr>
         <w:tc>
           <w:tcPr>
-            <w:tcW w:type="dxa" w:w="3230"/>
+            <w:tcW w:type="dxa" w:w="3249"/>
           </w:tcPr>
           <w:p>
             <w:r/>
@@ -264,7 +829,7 @@
         </w:tc>
         <w:tc>
           <w:tcPr>
-            <w:tcW w:type="dxa" w:w="3230"/>
+            <w:tcW w:type="dxa" w:w="3249"/>
           </w:tcPr>
           <w:p>
             <w:r/>
@@ -274,13 +839,13 @@
                 <w:b w:val="0"/>
                 <w:sz w:val="20"/>
               </w:rPr>
-              <w:t>Tenant (Khách thuê)</w:t>
+              <w:t>Tenant</w:t>
             </w:r>
           </w:p>
         </w:tc>
         <w:tc>
           <w:tcPr>
-            <w:tcW w:type="dxa" w:w="3230"/>
+            <w:tcW w:type="dxa" w:w="3249"/>
           </w:tcPr>
           <w:p>
             <w:r/>
@@ -290,7 +855,7 @@
                 <w:b w:val="0"/>
                 <w:sz w:val="20"/>
               </w:rPr>
-              <w:t>Tìm phòng, yêu thích, hẹn xem, thuê, hóa đơn, báo sự cố, đánh giá</w:t>
+              <w:t>Tìm phòng, hẹn, thuê, hóa đơn, sự cố, đánh giá</w:t>
             </w:r>
           </w:p>
         </w:tc>
@@ -298,7 +863,7 @@
       <w:tr>
         <w:tc>
           <w:tcPr>
-            <w:tcW w:type="dxa" w:w="3230"/>
+            <w:tcW w:type="dxa" w:w="3249"/>
           </w:tcPr>
           <w:p>
             <w:r/>
@@ -314,7 +879,7 @@
         </w:tc>
         <w:tc>
           <w:tcPr>
-            <w:tcW w:type="dxa" w:w="3230"/>
+            <w:tcW w:type="dxa" w:w="3249"/>
           </w:tcPr>
           <w:p>
             <w:r/>
@@ -324,13 +889,13 @@
                 <w:b w:val="0"/>
                 <w:sz w:val="20"/>
               </w:rPr>
-              <w:t>Manager (Quản lý)</w:t>
+              <w:t>Manager</w:t>
             </w:r>
           </w:p>
         </w:tc>
         <w:tc>
           <w:tcPr>
-            <w:tcW w:type="dxa" w:w="3230"/>
+            <w:tcW w:type="dxa" w:w="3249"/>
           </w:tcPr>
           <w:p>
             <w:r/>
@@ -340,7 +905,7 @@
                 <w:b w:val="0"/>
                 <w:sz w:val="20"/>
               </w:rPr>
-              <w:t>Ghi chỉ số điện/nước, xử lý sự cố (sau khi được chủ gán)</w:t>
+              <w:t>Ghi điện/nước, xử lý sự cố (sau khi được gán)</w:t>
             </w:r>
           </w:p>
         </w:tc>
@@ -358,7 +923,7 @@
           <w:i w:val="0"/>
           <w:sz w:val="22"/>
         </w:rPr>
-        <w:t>Chức năng dùng chung mọi vai trò:</w:t>
+        <w:t>Chức năng dùng chung:</w:t>
       </w:r>
     </w:p>
     <w:p>
@@ -397,7 +962,7 @@
           <w:b w:val="0"/>
           <w:sz w:val="22"/>
         </w:rPr>
-        <w:t>Hồ sơ — cập nhật thông tin / đổi mật khẩu</w:t>
+        <w:t>Hồ sơ — cập nhật TT / đổi mật khẩu</w:t>
       </w:r>
     </w:p>
     <w:p>
@@ -410,7 +975,7 @@
           <w:b w:val="0"/>
           <w:sz w:val="22"/>
         </w:rPr>
-        <w:t>Lịch — sự kiện hẹn / hợp đồng / hóa đơn / bảo trì theo phạm vi role</w:t>
+        <w:t>Lịch — hẹn / HĐ / hóa đơn / bảo trì theo phạm vi</w:t>
       </w:r>
     </w:p>
     <w:p>
@@ -441,29 +1006,15 @@
     </w:p>
     <w:p>
       <w:pPr>
-        <w:pStyle w:val="Heading1"/>
+        <w:pStyle w:val="Heading2"/>
       </w:pPr>
       <w:r>
         <w:rPr>
           <w:rFonts w:ascii="Times New Roman" w:hAnsi="Times New Roman" w:eastAsia="Times New Roman"/>
           <w:b/>
-          <w:sz w:val="32"/>
+          <w:sz w:val="28"/>
         </w:rPr>
         <w:t>1. Luồng xương sống (End-to-end)</w:t>
-      </w:r>
-    </w:p>
-    <w:p>
-      <w:pPr>
-        <w:spacing w:after="120" w:line="276" w:lineRule="auto"/>
-      </w:pPr>
-      <w:r>
-        <w:rPr>
-          <w:rFonts w:ascii="Times New Roman" w:hAnsi="Times New Roman" w:eastAsia="Times New Roman"/>
-          <w:b w:val="0"/>
-          <w:i w:val="0"/>
-          <w:sz w:val="22"/>
-        </w:rPr>
-        <w:t>Đây là luồng nghiệp vụ chính từ khi có tài sản đến vận hành thuê:</w:t>
       </w:r>
     </w:p>
     <w:p>
@@ -489,7 +1040,7 @@
           <w:b w:val="0"/>
           <w:sz w:val="22"/>
         </w:rPr>
-        <w:t>2. Chủ tạo Phòng (ảnh, tiện nghi, trạng thái Available).</w:t>
+        <w:t>2. Chủ tạo Phòng (ảnh, tiện nghi, Available).</w:t>
       </w:r>
     </w:p>
     <w:p>
@@ -502,7 +1053,7 @@
           <w:b w:val="0"/>
           <w:sz w:val="22"/>
         </w:rPr>
-        <w:t>3. Chủ Đăng tin mới (trạng thái Pending).</w:t>
+        <w:t>3. Chủ Đăng tin (Pending).</w:t>
       </w:r>
     </w:p>
     <w:p>
@@ -515,7 +1066,7 @@
           <w:b w:val="0"/>
           <w:sz w:val="22"/>
         </w:rPr>
-        <w:t>4. Admin Duyệt tin → tin hiển thị công khai.</w:t>
+        <w:t>4. Admin Duyệt/Từ chối → Thông báo tới chủ.</w:t>
       </w:r>
     </w:p>
     <w:p>
@@ -528,7 +1079,7 @@
           <w:b w:val="0"/>
           <w:sz w:val="22"/>
         </w:rPr>
-        <w:t>5. Khách Tìm phòng / thêm Yêu thích.</w:t>
+        <w:t>5. Nếu duyệt: tin public trên Tìm phòng.</w:t>
       </w:r>
     </w:p>
     <w:p>
@@ -541,7 +1092,7 @@
           <w:b w:val="0"/>
           <w:sz w:val="22"/>
         </w:rPr>
-        <w:t>6. Khách Đặt lịch hẹn xem phòng.</w:t>
+        <w:t>6. Khách tìm phòng / Yêu thích.</w:t>
       </w:r>
     </w:p>
     <w:p>
@@ -554,7 +1105,7 @@
           <w:b w:val="0"/>
           <w:sz w:val="22"/>
         </w:rPr>
-        <w:t>7. Chủ Xác nhận / Từ chối lịch hẹn.</w:t>
+        <w:t>7. Khách đặt lịch hẹn; Chủ xác nhận/từ chối.</w:t>
       </w:r>
     </w:p>
     <w:p>
@@ -567,7 +1118,7 @@
           <w:b w:val="0"/>
           <w:sz w:val="22"/>
         </w:rPr>
-        <w:t>8. Chủ Tạo hợp đồng Draft hoặc Gán khách → hợp đồng chuyển PendingConfirm; phòng vẫn Available; Dashboard «Đã thuê» chưa tăng.</w:t>
+        <w:t>8. Chủ tạo HĐ Draft hoặc gán khách → PendingConfirm (phòng vẫn Available).</w:t>
       </w:r>
     </w:p>
     <w:p>
@@ -580,7 +1131,7 @@
           <w:b w:val="0"/>
           <w:sz w:val="22"/>
         </w:rPr>
-        <w:t>9. Khách vào «Hợp đồng của tôi» → Đồng ý thuê hoặc Từ chối thuê.</w:t>
+        <w:t>9. Khách Đồng ý → Active + Occupied + «Đã thuê» tăng; hoặc Từ chối → Draft.</w:t>
       </w:r>
     </w:p>
     <w:p>
@@ -593,7 +1144,7 @@
           <w:b w:val="0"/>
           <w:sz w:val="22"/>
         </w:rPr>
-        <w:t>10. Nếu Đồng ý: Status = Active, phòng = Occupied, Dashboard «Đã thuê» tăng, thông báo cho chủ.</w:t>
+        <w:t>10. Chủ gán Manager (chỉ nhà có HĐ Active).</w:t>
       </w:r>
     </w:p>
     <w:p>
@@ -606,7 +1157,7 @@
           <w:b w:val="0"/>
           <w:sz w:val="22"/>
         </w:rPr>
-        <w:t>11. Nếu Từ chối: về Draft, bỏ TenantID, thông báo chủ.</w:t>
+        <w:t>11. Manager ghi chỉ số → hóa đơn; khách thanh toán.</w:t>
       </w:r>
     </w:p>
     <w:p>
@@ -619,123 +1170,18 @@
           <w:b w:val="0"/>
           <w:sz w:val="22"/>
         </w:rPr>
-        <w:t>12. Chủ Gán Manager cho nhà (chỉ khi nhà đã có ≥ 1 hợp đồng Active).</w:t>
+        <w:t>12. Khách báo sự cố → Manager xử lý; đánh giá theo phạm vi.</w:t>
       </w:r>
     </w:p>
     <w:p>
       <w:pPr>
-        <w:pStyle w:val="ListBullet"/>
-      </w:pPr>
-      <w:r>
-        <w:rPr>
-          <w:rFonts w:ascii="Times New Roman" w:hAnsi="Times New Roman" w:eastAsia="Times New Roman"/>
-          <w:b w:val="0"/>
-          <w:sz w:val="22"/>
-        </w:rPr>
-        <w:t>13. Manager Ghi chỉ số điện/nước → tạo/cập nhật hóa đơn.</w:t>
-      </w:r>
-    </w:p>
-    <w:p>
-      <w:pPr>
-        <w:pStyle w:val="ListBullet"/>
-      </w:pPr>
-      <w:r>
-        <w:rPr>
-          <w:rFonts w:ascii="Times New Roman" w:hAnsi="Times New Roman" w:eastAsia="Times New Roman"/>
-          <w:b w:val="0"/>
-          <w:sz w:val="22"/>
-        </w:rPr>
-        <w:t>14. Khách xem / thanh toán hóa đơn.</w:t>
-      </w:r>
-    </w:p>
-    <w:p>
-      <w:pPr>
-        <w:pStyle w:val="ListBullet"/>
-      </w:pPr>
-      <w:r>
-        <w:rPr>
-          <w:rFonts w:ascii="Times New Roman" w:hAnsi="Times New Roman" w:eastAsia="Times New Roman"/>
-          <w:b w:val="0"/>
-          <w:sz w:val="22"/>
-        </w:rPr>
-        <w:t>15. Khách Báo sự cố → Manager xử lý.</w:t>
-      </w:r>
-    </w:p>
-    <w:p>
-      <w:pPr>
-        <w:pStyle w:val="ListBullet"/>
-      </w:pPr>
-      <w:r>
-        <w:rPr>
-          <w:rFonts w:ascii="Times New Roman" w:hAnsi="Times New Roman" w:eastAsia="Times New Roman"/>
-          <w:b w:val="0"/>
-          <w:sz w:val="22"/>
-        </w:rPr>
-        <w:t>16. Khách / Chủ / Admin thao tác Đánh giá theo phạm vi.</w:t>
-      </w:r>
-    </w:p>
-    <w:p>
-      <w:pPr>
-        <w:spacing w:after="120" w:line="276" w:lineRule="auto"/>
+        <w:pStyle w:val="Heading2"/>
       </w:pPr>
       <w:r>
         <w:rPr>
           <w:rFonts w:ascii="Times New Roman" w:hAnsi="Times New Roman" w:eastAsia="Times New Roman"/>
           <w:b/>
-          <w:i w:val="0"/>
-          <w:sz w:val="22"/>
-        </w:rPr>
-        <w:t>Điểm khóa nghiệp vụ (cập nhật gần đây):</w:t>
-      </w:r>
-    </w:p>
-    <w:p>
-      <w:pPr>
-        <w:pStyle w:val="ListBullet"/>
-      </w:pPr>
-      <w:r>
-        <w:rPr>
-          <w:rFonts w:ascii="Times New Roman" w:hAnsi="Times New Roman" w:eastAsia="Times New Roman"/>
-          <w:b w:val="0"/>
-          <w:sz w:val="22"/>
-        </w:rPr>
-        <w:t>Gán khách / tạo HĐ có tenant → PendingConfirm, chưa Occupied.</w:t>
-      </w:r>
-    </w:p>
-    <w:p>
-      <w:pPr>
-        <w:pStyle w:val="ListBullet"/>
-      </w:pPr>
-      <w:r>
-        <w:rPr>
-          <w:rFonts w:ascii="Times New Roman" w:hAnsi="Times New Roman" w:eastAsia="Times New Roman"/>
-          <w:b w:val="0"/>
-          <w:sz w:val="22"/>
-        </w:rPr>
-        <w:t>Chỉ khi khách Đồng ý thuê → Active + Occupied + tăng «Đã thuê».</w:t>
-      </w:r>
-    </w:p>
-    <w:p>
-      <w:pPr>
-        <w:pStyle w:val="ListBullet"/>
-      </w:pPr>
-      <w:r>
-        <w:rPr>
-          <w:rFonts w:ascii="Times New Roman" w:hAnsi="Times New Roman" w:eastAsia="Times New Roman"/>
-          <w:b w:val="0"/>
-          <w:sz w:val="22"/>
-        </w:rPr>
-        <w:t>Chỉ gán Manager sau khi nhà có hợp đồng Active.</w:t>
-      </w:r>
-    </w:p>
-    <w:p>
-      <w:pPr>
-        <w:pStyle w:val="Heading1"/>
-      </w:pPr>
-      <w:r>
-        <w:rPr>
-          <w:rFonts w:ascii="Times New Roman" w:hAnsi="Times New Roman" w:eastAsia="Times New Roman"/>
-          <w:b/>
-          <w:sz w:val="32"/>
+          <w:sz w:val="28"/>
         </w:rPr>
         <w:t>2. Luồng Admin</w:t>
       </w:r>
@@ -747,14 +1193,14 @@
         <w:tblLook w:firstColumn="1" w:firstRow="1" w:lastColumn="0" w:lastRow="0" w:noHBand="0" w:noVBand="1" w:val="04A0"/>
       </w:tblPr>
       <w:tblGrid>
-        <w:gridCol w:w="3230"/>
-        <w:gridCol w:w="3230"/>
-        <w:gridCol w:w="3230"/>
+        <w:gridCol w:w="3249"/>
+        <w:gridCol w:w="3249"/>
+        <w:gridCol w:w="3249"/>
       </w:tblGrid>
       <w:tr>
         <w:tc>
           <w:tcPr>
-            <w:tcW w:type="dxa" w:w="3230"/>
+            <w:tcW w:type="dxa" w:w="3249"/>
           </w:tcPr>
           <w:p>
             <w:r/>
@@ -770,7 +1216,7 @@
         </w:tc>
         <w:tc>
           <w:tcPr>
-            <w:tcW w:type="dxa" w:w="3230"/>
+            <w:tcW w:type="dxa" w:w="3249"/>
           </w:tcPr>
           <w:p>
             <w:r/>
@@ -786,7 +1232,7 @@
         </w:tc>
         <w:tc>
           <w:tcPr>
-            <w:tcW w:type="dxa" w:w="3230"/>
+            <w:tcW w:type="dxa" w:w="3249"/>
           </w:tcPr>
           <w:p>
             <w:r/>
@@ -796,7 +1242,7 @@
                 <w:b/>
                 <w:sz w:val="20"/>
               </w:rPr>
-              <w:t>Các bước thực hiện</w:t>
+              <w:t>Các bước</w:t>
             </w:r>
           </w:p>
         </w:tc>
@@ -804,7 +1250,7 @@
       <w:tr>
         <w:tc>
           <w:tcPr>
-            <w:tcW w:type="dxa" w:w="3230"/>
+            <w:tcW w:type="dxa" w:w="3249"/>
           </w:tcPr>
           <w:p>
             <w:r/>
@@ -820,7 +1266,7 @@
         </w:tc>
         <w:tc>
           <w:tcPr>
-            <w:tcW w:type="dxa" w:w="3230"/>
+            <w:tcW w:type="dxa" w:w="3249"/>
           </w:tcPr>
           <w:p>
             <w:r/>
@@ -830,13 +1276,13 @@
                 <w:b w:val="0"/>
                 <w:sz w:val="20"/>
               </w:rPr>
-              <w:t>Quản lý người dùng</w:t>
+              <w:t>Người dùng</w:t>
             </w:r>
           </w:p>
         </w:tc>
         <w:tc>
           <w:tcPr>
-            <w:tcW w:type="dxa" w:w="3230"/>
+            <w:tcW w:type="dxa" w:w="3249"/>
           </w:tcPr>
           <w:p>
             <w:r/>
@@ -846,7 +1292,7 @@
                 <w:b w:val="0"/>
                 <w:sz w:val="20"/>
               </w:rPr>
-              <w:t>Vào menu → xem danh sách → Duyệt / Khóa / Active theo trạng thái tài khoản.</w:t>
+              <w:t>Danh sách → Duyệt / Khóa / Active</w:t>
             </w:r>
           </w:p>
         </w:tc>
@@ -854,7 +1300,7 @@
       <w:tr>
         <w:tc>
           <w:tcPr>
-            <w:tcW w:type="dxa" w:w="3230"/>
+            <w:tcW w:type="dxa" w:w="3249"/>
           </w:tcPr>
           <w:p>
             <w:r/>
@@ -870,7 +1316,7 @@
         </w:tc>
         <w:tc>
           <w:tcPr>
-            <w:tcW w:type="dxa" w:w="3230"/>
+            <w:tcW w:type="dxa" w:w="3249"/>
           </w:tcPr>
           <w:p>
             <w:r/>
@@ -880,13 +1326,13 @@
                 <w:b w:val="0"/>
                 <w:sz w:val="20"/>
               </w:rPr>
-              <w:t>Quản lý tin đăng</w:t>
+              <w:t>Tin đăng</w:t>
             </w:r>
           </w:p>
         </w:tc>
         <w:tc>
           <w:tcPr>
-            <w:tcW w:type="dxa" w:w="3230"/>
+            <w:tcW w:type="dxa" w:w="3249"/>
           </w:tcPr>
           <w:p>
             <w:r/>
@@ -896,7 +1342,7 @@
                 <w:b w:val="0"/>
                 <w:sz w:val="20"/>
               </w:rPr>
-              <w:t>Xem tin Pending → Duyệt hoặc Từ chối; tin duyệt mới hiện với khách.</w:t>
+              <w:t>Pending → Duyệt/Từ chối → TB chủ</w:t>
             </w:r>
           </w:p>
         </w:tc>
@@ -904,7 +1350,7 @@
       <w:tr>
         <w:tc>
           <w:tcPr>
-            <w:tcW w:type="dxa" w:w="3230"/>
+            <w:tcW w:type="dxa" w:w="3249"/>
           </w:tcPr>
           <w:p>
             <w:r/>
@@ -920,7 +1366,7 @@
         </w:tc>
         <w:tc>
           <w:tcPr>
-            <w:tcW w:type="dxa" w:w="3230"/>
+            <w:tcW w:type="dxa" w:w="3249"/>
           </w:tcPr>
           <w:p>
             <w:r/>
@@ -936,7 +1382,7 @@
         </w:tc>
         <w:tc>
           <w:tcPr>
-            <w:tcW w:type="dxa" w:w="3230"/>
+            <w:tcW w:type="dxa" w:w="3249"/>
           </w:tcPr>
           <w:p>
             <w:r/>
@@ -946,7 +1392,7 @@
                 <w:b w:val="0"/>
                 <w:sz w:val="20"/>
               </w:rPr>
-              <w:t>Xem / quản trị review (ẩn hoặc xử lý theo UI Admin).</w:t>
+              <w:t>Xem / quản trị review</w:t>
             </w:r>
           </w:p>
         </w:tc>
@@ -954,7 +1400,7 @@
       <w:tr>
         <w:tc>
           <w:tcPr>
-            <w:tcW w:type="dxa" w:w="3230"/>
+            <w:tcW w:type="dxa" w:w="3249"/>
           </w:tcPr>
           <w:p>
             <w:r/>
@@ -970,7 +1416,7 @@
         </w:tc>
         <w:tc>
           <w:tcPr>
-            <w:tcW w:type="dxa" w:w="3230"/>
+            <w:tcW w:type="dxa" w:w="3249"/>
           </w:tcPr>
           <w:p>
             <w:r/>
@@ -980,13 +1426,13 @@
                 <w:b w:val="0"/>
                 <w:sz w:val="20"/>
               </w:rPr>
-              <w:t>Nhật ký hệ thống</w:t>
+              <w:t>Nhật ký</w:t>
             </w:r>
           </w:p>
         </w:tc>
         <w:tc>
           <w:tcPr>
-            <w:tcW w:type="dxa" w:w="3230"/>
+            <w:tcW w:type="dxa" w:w="3249"/>
           </w:tcPr>
           <w:p>
             <w:r/>
@@ -996,7 +1442,7 @@
                 <w:b w:val="0"/>
                 <w:sz w:val="20"/>
               </w:rPr>
-              <w:t>Xem ActivityLog các hành động quan trọng.</w:t>
+              <w:t>ActivityLog</w:t>
             </w:r>
           </w:p>
         </w:tc>
@@ -1004,7 +1450,7 @@
       <w:tr>
         <w:tc>
           <w:tcPr>
-            <w:tcW w:type="dxa" w:w="3230"/>
+            <w:tcW w:type="dxa" w:w="3249"/>
           </w:tcPr>
           <w:p>
             <w:r/>
@@ -1020,7 +1466,23 @@
         </w:tc>
         <w:tc>
           <w:tcPr>
-            <w:tcW w:type="dxa" w:w="3230"/>
+            <w:tcW w:type="dxa" w:w="3249"/>
+          </w:tcPr>
+          <w:p>
+            <w:r/>
+            <w:r>
+              <w:rPr>
+                <w:rFonts w:ascii="Times New Roman" w:hAnsi="Times New Roman" w:eastAsia="Times New Roman"/>
+                <w:b w:val="0"/>
+                <w:sz w:val="20"/>
+              </w:rPr>
+              <w:t>Backup</w:t>
+            </w:r>
+          </w:p>
+        </w:tc>
+        <w:tc>
+          <w:tcPr>
+            <w:tcW w:type="dxa" w:w="3249"/>
           </w:tcPr>
           <w:p>
             <w:r/>
@@ -1034,27 +1496,11 @@
             </w:r>
           </w:p>
         </w:tc>
-        <w:tc>
-          <w:tcPr>
-            <w:tcW w:type="dxa" w:w="3230"/>
-          </w:tcPr>
-          <w:p>
-            <w:r/>
-            <w:r>
-              <w:rPr>
-                <w:rFonts w:ascii="Times New Roman" w:hAnsi="Times New Roman" w:eastAsia="Times New Roman"/>
-                <w:b w:val="0"/>
-                <w:sz w:val="20"/>
-              </w:rPr>
-              <w:t>Thực hiện backup qua màn Backup.</w:t>
-            </w:r>
-          </w:p>
-        </w:tc>
       </w:tr>
       <w:tr>
         <w:tc>
           <w:tcPr>
-            <w:tcW w:type="dxa" w:w="3230"/>
+            <w:tcW w:type="dxa" w:w="3249"/>
           </w:tcPr>
           <w:p>
             <w:r/>
@@ -1070,7 +1516,7 @@
         </w:tc>
         <w:tc>
           <w:tcPr>
-            <w:tcW w:type="dxa" w:w="3230"/>
+            <w:tcW w:type="dxa" w:w="3249"/>
           </w:tcPr>
           <w:p>
             <w:r/>
@@ -1080,13 +1526,13 @@
                 <w:b w:val="0"/>
                 <w:sz w:val="20"/>
               </w:rPr>
-              <w:t>Báo cáo</w:t>
+              <w:t>Báo cáo / Dashboard</w:t>
             </w:r>
           </w:p>
         </w:tc>
         <w:tc>
           <w:tcPr>
-            <w:tcW w:type="dxa" w:w="3230"/>
+            <w:tcW w:type="dxa" w:w="3249"/>
           </w:tcPr>
           <w:p>
             <w:r/>
@@ -1096,576 +1542,7 @@
                 <w:b w:val="0"/>
                 <w:sz w:val="20"/>
               </w:rPr>
-              <w:t>Xem báo cáo tổng quan hệ thống.</w:t>
-            </w:r>
-          </w:p>
-        </w:tc>
-      </w:tr>
-      <w:tr>
-        <w:tc>
-          <w:tcPr>
-            <w:tcW w:type="dxa" w:w="3230"/>
-          </w:tcPr>
-          <w:p>
-            <w:r/>
-            <w:r>
-              <w:rPr>
-                <w:rFonts w:ascii="Times New Roman" w:hAnsi="Times New Roman" w:eastAsia="Times New Roman"/>
-                <w:b w:val="0"/>
-                <w:sz w:val="20"/>
-              </w:rPr>
-              <w:t>A7</w:t>
-            </w:r>
-          </w:p>
-        </w:tc>
-        <w:tc>
-          <w:tcPr>
-            <w:tcW w:type="dxa" w:w="3230"/>
-          </w:tcPr>
-          <w:p>
-            <w:r/>
-            <w:r>
-              <w:rPr>
-                <w:rFonts w:ascii="Times New Roman" w:hAnsi="Times New Roman" w:eastAsia="Times New Roman"/>
-                <w:b w:val="0"/>
-                <w:sz w:val="20"/>
-              </w:rPr>
-              <w:t>Dashboard</w:t>
-            </w:r>
-          </w:p>
-        </w:tc>
-        <w:tc>
-          <w:tcPr>
-            <w:tcW w:type="dxa" w:w="3230"/>
-          </w:tcPr>
-          <w:p>
-            <w:r/>
-            <w:r>
-              <w:rPr>
-                <w:rFonts w:ascii="Times New Roman" w:hAnsi="Times New Roman" w:eastAsia="Times New Roman"/>
-                <w:b w:val="0"/>
-                <w:sz w:val="20"/>
-              </w:rPr>
-              <w:t>Theo dõi KPI: users, houses, rooms, posts…</w:t>
-            </w:r>
-          </w:p>
-        </w:tc>
-      </w:tr>
-    </w:tbl>
-    <w:p/>
-    <w:p>
-      <w:pPr>
-        <w:pStyle w:val="Heading1"/>
-      </w:pPr>
-      <w:r>
-        <w:rPr>
-          <w:rFonts w:ascii="Times New Roman" w:hAnsi="Times New Roman" w:eastAsia="Times New Roman"/>
-          <w:b/>
-          <w:sz w:val="32"/>
-        </w:rPr>
-        <w:t>3. Luồng Landlord (Chủ nhà)</w:t>
-      </w:r>
-    </w:p>
-    <w:p>
-      <w:pPr>
-        <w:pStyle w:val="Heading2"/>
-      </w:pPr>
-      <w:r>
-        <w:rPr>
-          <w:rFonts w:ascii="Times New Roman" w:hAnsi="Times New Roman" w:eastAsia="Times New Roman"/>
-          <w:b/>
-          <w:sz w:val="28"/>
-        </w:rPr>
-        <w:t>3.1. Quản lý tài sản</w:t>
-      </w:r>
-    </w:p>
-    <w:p>
-      <w:pPr>
-        <w:pStyle w:val="ListBullet"/>
-      </w:pPr>
-      <w:r>
-        <w:rPr>
-          <w:rFonts w:ascii="Times New Roman" w:hAnsi="Times New Roman" w:eastAsia="Times New Roman"/>
-          <w:b w:val="0"/>
-          <w:sz w:val="22"/>
-        </w:rPr>
-        <w:t>Nhà của tôi → Thêm / Sửa / quản lý trạng thái nhà.</w:t>
-      </w:r>
-    </w:p>
-    <w:p>
-      <w:pPr>
-        <w:pStyle w:val="ListBullet"/>
-      </w:pPr>
-      <w:r>
-        <w:rPr>
-          <w:rFonts w:ascii="Times New Roman" w:hAnsi="Times New Roman" w:eastAsia="Times New Roman"/>
-          <w:b w:val="0"/>
-          <w:sz w:val="22"/>
-        </w:rPr>
-        <w:t>Phòng của tôi → Chọn nhà → Thêm/Sửa phòng, upload ảnh, gắn tiện nghi, lọc theo trạng thái.</w:t>
-      </w:r>
-    </w:p>
-    <w:p>
-      <w:pPr>
-        <w:pStyle w:val="Heading2"/>
-      </w:pPr>
-      <w:r>
-        <w:rPr>
-          <w:rFonts w:ascii="Times New Roman" w:hAnsi="Times New Roman" w:eastAsia="Times New Roman"/>
-          <w:b/>
-          <w:sz w:val="28"/>
-        </w:rPr>
-        <w:t>3.2. Marketing và lịch hẹn</w:t>
-      </w:r>
-    </w:p>
-    <w:p>
-      <w:pPr>
-        <w:pStyle w:val="ListBullet"/>
-      </w:pPr>
-      <w:r>
-        <w:rPr>
-          <w:rFonts w:ascii="Times New Roman" w:hAnsi="Times New Roman" w:eastAsia="Times New Roman"/>
-          <w:b w:val="0"/>
-          <w:sz w:val="22"/>
-        </w:rPr>
-        <w:t>Đăng tin mới → gắn phòng → gửi duyệt (Pending).</w:t>
-      </w:r>
-    </w:p>
-    <w:p>
-      <w:pPr>
-        <w:pStyle w:val="ListBullet"/>
-      </w:pPr>
-      <w:r>
-        <w:rPr>
-          <w:rFonts w:ascii="Times New Roman" w:hAnsi="Times New Roman" w:eastAsia="Times New Roman"/>
-          <w:b w:val="0"/>
-          <w:sz w:val="22"/>
-        </w:rPr>
-        <w:t>Sau khi Admin duyệt → tin xuất hiện ở Tìm phòng của khách.</w:t>
-      </w:r>
-    </w:p>
-    <w:p>
-      <w:pPr>
-        <w:pStyle w:val="ListBullet"/>
-      </w:pPr>
-      <w:r>
-        <w:rPr>
-          <w:rFonts w:ascii="Times New Roman" w:hAnsi="Times New Roman" w:eastAsia="Times New Roman"/>
-          <w:b w:val="0"/>
-          <w:sz w:val="22"/>
-        </w:rPr>
-        <w:t>Lịch hẹn xem phòng → xử lý Pending / Confirmed / Rejected / Completed…</w:t>
-      </w:r>
-    </w:p>
-    <w:p>
-      <w:pPr>
-        <w:pStyle w:val="ListBullet"/>
-      </w:pPr>
-      <w:r>
-        <w:rPr>
-          <w:rFonts w:ascii="Times New Roman" w:hAnsi="Times New Roman" w:eastAsia="Times New Roman"/>
-          <w:b w:val="0"/>
-          <w:sz w:val="22"/>
-        </w:rPr>
-        <w:t>Chat với khách khi cần trao đổi.</w:t>
-      </w:r>
-    </w:p>
-    <w:p>
-      <w:pPr>
-        <w:pStyle w:val="Heading2"/>
-      </w:pPr>
-      <w:r>
-        <w:rPr>
-          <w:rFonts w:ascii="Times New Roman" w:hAnsi="Times New Roman" w:eastAsia="Times New Roman"/>
-          <w:b/>
-          <w:sz w:val="28"/>
-        </w:rPr>
-        <w:t>3.3. Hợp đồng</w:t>
-      </w:r>
-    </w:p>
-    <w:p>
-      <w:pPr>
-        <w:spacing w:after="120" w:line="276" w:lineRule="auto"/>
-      </w:pPr>
-      <w:r>
-        <w:rPr>
-          <w:rFonts w:ascii="Times New Roman" w:hAnsi="Times New Roman" w:eastAsia="Times New Roman"/>
-          <w:b/>
-          <w:i w:val="0"/>
-          <w:sz w:val="22"/>
-        </w:rPr>
-        <w:t>Máy trạng thái hợp đồng:</w:t>
-      </w:r>
-    </w:p>
-    <w:p>
-      <w:pPr>
-        <w:pStyle w:val="ListBullet"/>
-      </w:pPr>
-      <w:r>
-        <w:rPr>
-          <w:rFonts w:ascii="Times New Roman" w:hAnsi="Times New Roman" w:eastAsia="Times New Roman"/>
-          <w:b w:val="0"/>
-          <w:sz w:val="22"/>
-        </w:rPr>
-        <w:t>Tạo không tenant → Draft.</w:t>
-      </w:r>
-    </w:p>
-    <w:p>
-      <w:pPr>
-        <w:pStyle w:val="ListBullet"/>
-      </w:pPr>
-      <w:r>
-        <w:rPr>
-          <w:rFonts w:ascii="Times New Roman" w:hAnsi="Times New Roman" w:eastAsia="Times New Roman"/>
-          <w:b w:val="0"/>
-          <w:sz w:val="22"/>
-        </w:rPr>
-        <w:t>Tạo có tenant / Gán khách → PendingConfirm (+ thông báo khách).</w:t>
-      </w:r>
-    </w:p>
-    <w:p>
-      <w:pPr>
-        <w:pStyle w:val="ListBullet"/>
-      </w:pPr>
-      <w:r>
-        <w:rPr>
-          <w:rFonts w:ascii="Times New Roman" w:hAnsi="Times New Roman" w:eastAsia="Times New Roman"/>
-          <w:b w:val="0"/>
-          <w:sz w:val="22"/>
-        </w:rPr>
-        <w:t>Khách Đồng ý → Active (+ Occupied).</w:t>
-      </w:r>
-    </w:p>
-    <w:p>
-      <w:pPr>
-        <w:pStyle w:val="ListBullet"/>
-      </w:pPr>
-      <w:r>
-        <w:rPr>
-          <w:rFonts w:ascii="Times New Roman" w:hAnsi="Times New Roman" w:eastAsia="Times New Roman"/>
-          <w:b w:val="0"/>
-          <w:sz w:val="22"/>
-        </w:rPr>
-        <w:t>Khách Từ chối → Draft (xóa tenant trên HĐ).</w:t>
-      </w:r>
-    </w:p>
-    <w:p>
-      <w:pPr>
-        <w:pStyle w:val="ListBullet"/>
-      </w:pPr>
-      <w:r>
-        <w:rPr>
-          <w:rFonts w:ascii="Times New Roman" w:hAnsi="Times New Roman" w:eastAsia="Times New Roman"/>
-          <w:b w:val="0"/>
-          <w:sz w:val="22"/>
-        </w:rPr>
-        <w:t>Chủ hủy/kết thúc được phép với Draft, PendingConfirm, Active → Terminated.</w:t>
-      </w:r>
-    </w:p>
-    <w:p>
-      <w:pPr>
-        <w:pStyle w:val="ListBullet"/>
-      </w:pPr>
-      <w:r>
-        <w:rPr>
-          <w:rFonts w:ascii="Times New Roman" w:hAnsi="Times New Roman" w:eastAsia="Times New Roman"/>
-          <w:b w:val="0"/>
-          <w:sz w:val="22"/>
-        </w:rPr>
-        <w:t>Gia hạn / In-Xuất PDF khi HĐ hợp lệ (chủ yếu Active).</w:t>
-      </w:r>
-    </w:p>
-    <w:p>
-      <w:pPr>
-        <w:pStyle w:val="ListBullet"/>
-      </w:pPr>
-      <w:r>
-        <w:rPr>
-          <w:rFonts w:ascii="Times New Roman" w:hAnsi="Times New Roman" w:eastAsia="Times New Roman"/>
-          <w:b w:val="0"/>
-          <w:sz w:val="22"/>
-        </w:rPr>
-        <w:t>Sửa HĐ có thể sinh trạng thái chờ khách xác nhận (PendingEdit) nếu có.</w:t>
-      </w:r>
-    </w:p>
-    <w:tbl>
-      <w:tblPr>
-        <w:tblStyle w:val="TableGrid"/>
-        <w:tblW w:type="auto" w:w="0"/>
-        <w:tblLook w:firstColumn="1" w:firstRow="1" w:lastColumn="0" w:lastRow="0" w:noHBand="0" w:noVBand="1" w:val="04A0"/>
-      </w:tblPr>
-      <w:tblGrid>
-        <w:gridCol w:w="4844"/>
-        <w:gridCol w:w="4844"/>
-      </w:tblGrid>
-      <w:tr>
-        <w:tc>
-          <w:tcPr>
-            <w:tcW w:type="dxa" w:w="4844"/>
-          </w:tcPr>
-          <w:p>
-            <w:r/>
-            <w:r>
-              <w:rPr>
-                <w:rFonts w:ascii="Times New Roman" w:hAnsi="Times New Roman" w:eastAsia="Times New Roman"/>
-                <w:b/>
-                <w:sz w:val="20"/>
-              </w:rPr>
-              <w:t>Hành động chủ</w:t>
-            </w:r>
-          </w:p>
-        </w:tc>
-        <w:tc>
-          <w:tcPr>
-            <w:tcW w:type="dxa" w:w="4844"/>
-          </w:tcPr>
-          <w:p>
-            <w:r/>
-            <w:r>
-              <w:rPr>
-                <w:rFonts w:ascii="Times New Roman" w:hAnsi="Times New Roman" w:eastAsia="Times New Roman"/>
-                <w:b/>
-                <w:sz w:val="20"/>
-              </w:rPr>
-              <w:t>Điều kiện / Kết quả</w:t>
-            </w:r>
-          </w:p>
-        </w:tc>
-      </w:tr>
-      <w:tr>
-        <w:tc>
-          <w:tcPr>
-            <w:tcW w:type="dxa" w:w="4844"/>
-          </w:tcPr>
-          <w:p>
-            <w:r/>
-            <w:r>
-              <w:rPr>
-                <w:rFonts w:ascii="Times New Roman" w:hAnsi="Times New Roman" w:eastAsia="Times New Roman"/>
-                <w:b w:val="0"/>
-                <w:sz w:val="20"/>
-              </w:rPr>
-              <w:t>Tạo HĐ không khách</w:t>
-            </w:r>
-          </w:p>
-        </w:tc>
-        <w:tc>
-          <w:tcPr>
-            <w:tcW w:type="dxa" w:w="4844"/>
-          </w:tcPr>
-          <w:p>
-            <w:r/>
-            <w:r>
-              <w:rPr>
-                <w:rFonts w:ascii="Times New Roman" w:hAnsi="Times New Roman" w:eastAsia="Times New Roman"/>
-                <w:b w:val="0"/>
-                <w:sz w:val="20"/>
-              </w:rPr>
-              <w:t>Status = Draft</w:t>
-            </w:r>
-          </w:p>
-        </w:tc>
-      </w:tr>
-      <w:tr>
-        <w:tc>
-          <w:tcPr>
-            <w:tcW w:type="dxa" w:w="4844"/>
-          </w:tcPr>
-          <w:p>
-            <w:r/>
-            <w:r>
-              <w:rPr>
-                <w:rFonts w:ascii="Times New Roman" w:hAnsi="Times New Roman" w:eastAsia="Times New Roman"/>
-                <w:b w:val="0"/>
-                <w:sz w:val="20"/>
-              </w:rPr>
-              <w:t>Tạo HĐ có khách / Gán khách</w:t>
-            </w:r>
-          </w:p>
-        </w:tc>
-        <w:tc>
-          <w:tcPr>
-            <w:tcW w:type="dxa" w:w="4844"/>
-          </w:tcPr>
-          <w:p>
-            <w:r/>
-            <w:r>
-              <w:rPr>
-                <w:rFonts w:ascii="Times New Roman" w:hAnsi="Times New Roman" w:eastAsia="Times New Roman"/>
-                <w:b w:val="0"/>
-                <w:sz w:val="20"/>
-              </w:rPr>
-              <w:t>Status = PendingConfirm; phòng vẫn Available</w:t>
-            </w:r>
-          </w:p>
-        </w:tc>
-      </w:tr>
-      <w:tr>
-        <w:tc>
-          <w:tcPr>
-            <w:tcW w:type="dxa" w:w="4844"/>
-          </w:tcPr>
-          <w:p>
-            <w:r/>
-            <w:r>
-              <w:rPr>
-                <w:rFonts w:ascii="Times New Roman" w:hAnsi="Times New Roman" w:eastAsia="Times New Roman"/>
-                <w:b w:val="0"/>
-                <w:sz w:val="20"/>
-              </w:rPr>
-              <w:t>In / Xuất PDF</w:t>
-            </w:r>
-          </w:p>
-        </w:tc>
-        <w:tc>
-          <w:tcPr>
-            <w:tcW w:type="dxa" w:w="4844"/>
-          </w:tcPr>
-          <w:p>
-            <w:r/>
-            <w:r>
-              <w:rPr>
-                <w:rFonts w:ascii="Times New Roman" w:hAnsi="Times New Roman" w:eastAsia="Times New Roman"/>
-                <w:b w:val="0"/>
-                <w:sz w:val="20"/>
-              </w:rPr>
-              <w:t>Theo hợp đồng đang chọn</w:t>
-            </w:r>
-          </w:p>
-        </w:tc>
-      </w:tr>
-      <w:tr>
-        <w:tc>
-          <w:tcPr>
-            <w:tcW w:type="dxa" w:w="4844"/>
-          </w:tcPr>
-          <w:p>
-            <w:r/>
-            <w:r>
-              <w:rPr>
-                <w:rFonts w:ascii="Times New Roman" w:hAnsi="Times New Roman" w:eastAsia="Times New Roman"/>
-                <w:b w:val="0"/>
-                <w:sz w:val="20"/>
-              </w:rPr>
-              <w:t>Gia hạn</w:t>
-            </w:r>
-          </w:p>
-        </w:tc>
-        <w:tc>
-          <w:tcPr>
-            <w:tcW w:type="dxa" w:w="4844"/>
-          </w:tcPr>
-          <w:p>
-            <w:r/>
-            <w:r>
-              <w:rPr>
-                <w:rFonts w:ascii="Times New Roman" w:hAnsi="Times New Roman" w:eastAsia="Times New Roman"/>
-                <w:b w:val="0"/>
-                <w:sz w:val="20"/>
-              </w:rPr>
-              <w:t>Hợp đồng Active</w:t>
-            </w:r>
-          </w:p>
-        </w:tc>
-      </w:tr>
-      <w:tr>
-        <w:tc>
-          <w:tcPr>
-            <w:tcW w:type="dxa" w:w="4844"/>
-          </w:tcPr>
-          <w:p>
-            <w:r/>
-            <w:r>
-              <w:rPr>
-                <w:rFonts w:ascii="Times New Roman" w:hAnsi="Times New Roman" w:eastAsia="Times New Roman"/>
-                <w:b w:val="0"/>
-                <w:sz w:val="20"/>
-              </w:rPr>
-              <w:t>Hủy / Kết thúc</w:t>
-            </w:r>
-          </w:p>
-        </w:tc>
-        <w:tc>
-          <w:tcPr>
-            <w:tcW w:type="dxa" w:w="4844"/>
-          </w:tcPr>
-          <w:p>
-            <w:r/>
-            <w:r>
-              <w:rPr>
-                <w:rFonts w:ascii="Times New Roman" w:hAnsi="Times New Roman" w:eastAsia="Times New Roman"/>
-                <w:b w:val="0"/>
-                <w:sz w:val="20"/>
-              </w:rPr>
-              <w:t>Draft, PendingConfirm hoặc Active → Terminated</w:t>
-            </w:r>
-          </w:p>
-        </w:tc>
-      </w:tr>
-      <w:tr>
-        <w:tc>
-          <w:tcPr>
-            <w:tcW w:type="dxa" w:w="4844"/>
-          </w:tcPr>
-          <w:p>
-            <w:r/>
-            <w:r>
-              <w:rPr>
-                <w:rFonts w:ascii="Times New Roman" w:hAnsi="Times New Roman" w:eastAsia="Times New Roman"/>
-                <w:b w:val="0"/>
-                <w:sz w:val="20"/>
-              </w:rPr>
-              <w:t>Dashboard «Chờ khách xác nhận»</w:t>
-            </w:r>
-          </w:p>
-        </w:tc>
-        <w:tc>
-          <w:tcPr>
-            <w:tcW w:type="dxa" w:w="4844"/>
-          </w:tcPr>
-          <w:p>
-            <w:r/>
-            <w:r>
-              <w:rPr>
-                <w:rFonts w:ascii="Times New Roman" w:hAnsi="Times New Roman" w:eastAsia="Times New Roman"/>
-                <w:b w:val="0"/>
-                <w:sz w:val="20"/>
-              </w:rPr>
-              <w:t>Đếm HĐ PendingConfirm</w:t>
-            </w:r>
-          </w:p>
-        </w:tc>
-      </w:tr>
-      <w:tr>
-        <w:tc>
-          <w:tcPr>
-            <w:tcW w:type="dxa" w:w="4844"/>
-          </w:tcPr>
-          <w:p>
-            <w:r/>
-            <w:r>
-              <w:rPr>
-                <w:rFonts w:ascii="Times New Roman" w:hAnsi="Times New Roman" w:eastAsia="Times New Roman"/>
-                <w:b w:val="0"/>
-                <w:sz w:val="20"/>
-              </w:rPr>
-              <w:t>Dashboard «Đã thuê»</w:t>
-            </w:r>
-          </w:p>
-        </w:tc>
-        <w:tc>
-          <w:tcPr>
-            <w:tcW w:type="dxa" w:w="4844"/>
-          </w:tcPr>
-          <w:p>
-            <w:r/>
-            <w:r>
-              <w:rPr>
-                <w:rFonts w:ascii="Times New Roman" w:hAnsi="Times New Roman" w:eastAsia="Times New Roman"/>
-                <w:b w:val="0"/>
-                <w:sz w:val="20"/>
-              </w:rPr>
-              <w:t>Tăng khi phòng Occupied / HĐ Active sau khách đồng ý</w:t>
+              <w:t>KPI hệ thống</w:t>
             </w:r>
           </w:p>
         </w:tc>
@@ -1682,7 +1559,20 @@
           <w:b/>
           <w:sz w:val="28"/>
         </w:rPr>
-        <w:t>3.4. Phân công Manager</w:t>
+        <w:t>3. Luồng Landlord</w:t>
+      </w:r>
+    </w:p>
+    <w:p>
+      <w:pPr>
+        <w:pStyle w:val="Heading3"/>
+      </w:pPr>
+      <w:r>
+        <w:rPr>
+          <w:rFonts w:ascii="Times New Roman" w:hAnsi="Times New Roman" w:eastAsia="Times New Roman"/>
+          <w:b/>
+          <w:sz w:val="24"/>
+        </w:rPr>
+        <w:t>3.1 Tài sản</w:t>
       </w:r>
     </w:p>
     <w:p>
@@ -1695,7 +1585,7 @@
           <w:b w:val="0"/>
           <w:sz w:val="22"/>
         </w:rPr>
-        <w:t>Điều kiện: nhà đã có ít nhất một hợp đồng Active (khách đã Đồng ý thuê).</w:t>
+        <w:t>Nhà của tôi → Thêm/Sửa nhà.</w:t>
       </w:r>
     </w:p>
     <w:p>
@@ -1708,7 +1598,20 @@
           <w:b w:val="0"/>
           <w:sz w:val="22"/>
         </w:rPr>
-        <w:t>Vào Phân công Manager → nhập UserID hoặc Username Manager → Tìm → chọn nhà → Gán.</w:t>
+        <w:t>Phòng của tôi → Thêm/Sửa, ảnh, tiện nghi, lọc trạng thái.</w:t>
+      </w:r>
+    </w:p>
+    <w:p>
+      <w:pPr>
+        <w:pStyle w:val="Heading3"/>
+      </w:pPr>
+      <w:r>
+        <w:rPr>
+          <w:rFonts w:ascii="Times New Roman" w:hAnsi="Times New Roman" w:eastAsia="Times New Roman"/>
+          <w:b/>
+          <w:sz w:val="24"/>
+        </w:rPr>
+        <w:t>3.2 Marketing &amp; hẹn</w:t>
       </w:r>
     </w:p>
     <w:p>
@@ -1721,7 +1624,7 @@
           <w:b w:val="0"/>
           <w:sz w:val="22"/>
         </w:rPr>
-        <w:t>Có thể Ngưng phân công (Inactive).</w:t>
+        <w:t>Đăng tin → chờ Admin; nhận TB duyệt/từ chối.</w:t>
       </w:r>
     </w:p>
     <w:p>
@@ -1734,7 +1637,124 @@
           <w:b w:val="0"/>
           <w:sz w:val="22"/>
         </w:rPr>
-        <w:t>Nhà chưa có HĐ Active không xuất hiện trong danh sách chọn / BLL từ chối gán.</w:t>
+        <w:t>Lịch hẹn xem phòng; Chat với khách.</w:t>
+      </w:r>
+    </w:p>
+    <w:p>
+      <w:pPr>
+        <w:pStyle w:val="Heading3"/>
+      </w:pPr>
+      <w:r>
+        <w:rPr>
+          <w:rFonts w:ascii="Times New Roman" w:hAnsi="Times New Roman" w:eastAsia="Times New Roman"/>
+          <w:b/>
+          <w:sz w:val="24"/>
+        </w:rPr>
+        <w:t>3.3 Hợp đồng</w:t>
+      </w:r>
+    </w:p>
+    <w:p>
+      <w:pPr>
+        <w:pStyle w:val="ListBullet"/>
+      </w:pPr>
+      <w:r>
+        <w:rPr>
+          <w:rFonts w:ascii="Times New Roman" w:hAnsi="Times New Roman" w:eastAsia="Times New Roman"/>
+          <w:b w:val="0"/>
+          <w:sz w:val="22"/>
+        </w:rPr>
+        <w:t>Không tenant → Draft; có tenant/gán khách → PendingConfirm.</w:t>
+      </w:r>
+    </w:p>
+    <w:p>
+      <w:pPr>
+        <w:pStyle w:val="ListBullet"/>
+      </w:pPr>
+      <w:r>
+        <w:rPr>
+          <w:rFonts w:ascii="Times New Roman" w:hAnsi="Times New Roman" w:eastAsia="Times New Roman"/>
+          <w:b w:val="0"/>
+          <w:sz w:val="22"/>
+        </w:rPr>
+        <w:t>Khách Đồng ý → Active (+Occupied); Từ chối → Draft.</w:t>
+      </w:r>
+    </w:p>
+    <w:p>
+      <w:pPr>
+        <w:pStyle w:val="ListBullet"/>
+      </w:pPr>
+      <w:r>
+        <w:rPr>
+          <w:rFonts w:ascii="Times New Roman" w:hAnsi="Times New Roman" w:eastAsia="Times New Roman"/>
+          <w:b w:val="0"/>
+          <w:sz w:val="22"/>
+        </w:rPr>
+        <w:t>Hủy được Draft/PendingConfirm/Active → Terminated.</w:t>
+      </w:r>
+    </w:p>
+    <w:p>
+      <w:pPr>
+        <w:pStyle w:val="ListBullet"/>
+      </w:pPr>
+      <w:r>
+        <w:rPr>
+          <w:rFonts w:ascii="Times New Roman" w:hAnsi="Times New Roman" w:eastAsia="Times New Roman"/>
+          <w:b w:val="0"/>
+          <w:sz w:val="22"/>
+        </w:rPr>
+        <w:t>Gia hạn / In-PDF; PendingEdit chờ khách nếu có.</w:t>
+      </w:r>
+    </w:p>
+    <w:p>
+      <w:pPr>
+        <w:pStyle w:val="ListBullet"/>
+      </w:pPr>
+      <w:r>
+        <w:rPr>
+          <w:rFonts w:ascii="Times New Roman" w:hAnsi="Times New Roman" w:eastAsia="Times New Roman"/>
+          <w:b w:val="0"/>
+          <w:sz w:val="22"/>
+        </w:rPr>
+        <w:t>Dashboard: «Chờ khách xác nhận» và «Đã thuê».</w:t>
+      </w:r>
+    </w:p>
+    <w:p>
+      <w:pPr>
+        <w:pStyle w:val="Heading3"/>
+      </w:pPr>
+      <w:r>
+        <w:rPr>
+          <w:rFonts w:ascii="Times New Roman" w:hAnsi="Times New Roman" w:eastAsia="Times New Roman"/>
+          <w:b/>
+          <w:sz w:val="24"/>
+        </w:rPr>
+        <w:t>3.4 Phân công Manager</w:t>
+      </w:r>
+    </w:p>
+    <w:p>
+      <w:pPr>
+        <w:pStyle w:val="ListBullet"/>
+      </w:pPr>
+      <w:r>
+        <w:rPr>
+          <w:rFonts w:ascii="Times New Roman" w:hAnsi="Times New Roman" w:eastAsia="Times New Roman"/>
+          <w:b w:val="0"/>
+          <w:sz w:val="22"/>
+        </w:rPr>
+        <w:t>Chỉ khi nhà có ≥ 1 HĐ Active.</w:t>
+      </w:r>
+    </w:p>
+    <w:p>
+      <w:pPr>
+        <w:pStyle w:val="ListBullet"/>
+      </w:pPr>
+      <w:r>
+        <w:rPr>
+          <w:rFonts w:ascii="Times New Roman" w:hAnsi="Times New Roman" w:eastAsia="Times New Roman"/>
+          <w:b w:val="0"/>
+          <w:sz w:val="22"/>
+        </w:rPr>
+        <w:t>Nhập UserID/Username Manager → Tìm → Gán; có thể Ngưng.</w:t>
       </w:r>
     </w:p>
     <w:p>
@@ -1747,7 +1767,7 @@
           <w:b/>
           <w:sz w:val="28"/>
         </w:rPr>
-        <w:t>3.5. Sau vận hành</w:t>
+        <w:t>4. Luồng Tenant</w:t>
       </w:r>
     </w:p>
     <w:p>
@@ -1760,7 +1780,7 @@
           <w:b w:val="0"/>
           <w:sz w:val="22"/>
         </w:rPr>
-        <w:t>Đánh giá — xem review liên quan nhà/phòng.</w:t>
+        <w:t>Trước thuê: Tìm phòng → Yêu thích → Đặt hẹn → Chat.</w:t>
       </w:r>
     </w:p>
     <w:p>
@@ -1773,33 +1793,7 @@
           <w:b w:val="0"/>
           <w:sz w:val="22"/>
         </w:rPr>
-        <w:t>Báo cáo / Lịch / Thông báo.</w:t>
-      </w:r>
-    </w:p>
-    <w:p>
-      <w:pPr>
-        <w:pStyle w:val="Heading1"/>
-      </w:pPr>
-      <w:r>
-        <w:rPr>
-          <w:rFonts w:ascii="Times New Roman" w:hAnsi="Times New Roman" w:eastAsia="Times New Roman"/>
-          <w:b/>
-          <w:sz w:val="32"/>
-        </w:rPr>
-        <w:t>4. Luồng Tenant (Khách thuê)</w:t>
-      </w:r>
-    </w:p>
-    <w:p>
-      <w:pPr>
-        <w:pStyle w:val="Heading2"/>
-      </w:pPr>
-      <w:r>
-        <w:rPr>
-          <w:rFonts w:ascii="Times New Roman" w:hAnsi="Times New Roman" w:eastAsia="Times New Roman"/>
-          <w:b/>
-          <w:sz w:val="28"/>
-        </w:rPr>
-        <w:t>4.1. Trước khi thuê</w:t>
+        <w:t>Thuê: PendingConfirm → Đồng ý/Từ chối; PendingEdit; xin gia hạn/hủy; In HĐ.</w:t>
       </w:r>
     </w:p>
     <w:p>
@@ -1812,46 +1806,7 @@
           <w:b w:val="0"/>
           <w:sz w:val="22"/>
         </w:rPr>
-        <w:t>Tìm phòng (tin đã được Admin duyệt) → xem chi tiết.</w:t>
-      </w:r>
-    </w:p>
-    <w:p>
-      <w:pPr>
-        <w:pStyle w:val="ListBullet"/>
-      </w:pPr>
-      <w:r>
-        <w:rPr>
-          <w:rFonts w:ascii="Times New Roman" w:hAnsi="Times New Roman" w:eastAsia="Times New Roman"/>
-          <w:b w:val="0"/>
-          <w:sz w:val="22"/>
-        </w:rPr>
-        <w:t>Thêm Yêu thích (tuỳ chọn).</w:t>
-      </w:r>
-    </w:p>
-    <w:p>
-      <w:pPr>
-        <w:pStyle w:val="ListBullet"/>
-      </w:pPr>
-      <w:r>
-        <w:rPr>
-          <w:rFonts w:ascii="Times New Roman" w:hAnsi="Times New Roman" w:eastAsia="Times New Roman"/>
-          <w:b w:val="0"/>
-          <w:sz w:val="22"/>
-        </w:rPr>
-        <w:t>Đặt lịch hẹn → chờ chủ xác nhận.</w:t>
-      </w:r>
-    </w:p>
-    <w:p>
-      <w:pPr>
-        <w:pStyle w:val="ListBullet"/>
-      </w:pPr>
-      <w:r>
-        <w:rPr>
-          <w:rFonts w:ascii="Times New Roman" w:hAnsi="Times New Roman" w:eastAsia="Times New Roman"/>
-          <w:b w:val="0"/>
-          <w:sz w:val="22"/>
-        </w:rPr>
-        <w:t>Chat với chủ nhà.</w:t>
+        <w:t>Trong thuê: Hóa đơn, Báo sự cố, Đánh giá.</w:t>
       </w:r>
     </w:p>
     <w:p>
@@ -1863,162 +1818,6 @@
           <w:rFonts w:ascii="Times New Roman" w:hAnsi="Times New Roman" w:eastAsia="Times New Roman"/>
           <w:b/>
           <w:sz w:val="28"/>
-        </w:rPr>
-        <w:t>4.2. Thuê và hợp đồng</w:t>
-      </w:r>
-    </w:p>
-    <w:p>
-      <w:pPr>
-        <w:pStyle w:val="ListBullet"/>
-      </w:pPr>
-      <w:r>
-        <w:rPr>
-          <w:rFonts w:ascii="Times New Roman" w:hAnsi="Times New Roman" w:eastAsia="Times New Roman"/>
-          <w:b w:val="0"/>
-          <w:sz w:val="22"/>
-        </w:rPr>
-        <w:t>Nhận đề nghị thuê (thông báo) → Hợp đồng của tôi hiện PendingConfirm.</w:t>
-      </w:r>
-    </w:p>
-    <w:p>
-      <w:pPr>
-        <w:pStyle w:val="ListBullet"/>
-      </w:pPr>
-      <w:r>
-        <w:rPr>
-          <w:rFonts w:ascii="Times New Roman" w:hAnsi="Times New Roman" w:eastAsia="Times New Roman"/>
-          <w:b w:val="0"/>
-          <w:sz w:val="22"/>
-        </w:rPr>
-        <w:t>Bấm Đồng ý thuê → Active + Occupied.</w:t>
-      </w:r>
-    </w:p>
-    <w:p>
-      <w:pPr>
-        <w:pStyle w:val="ListBullet"/>
-      </w:pPr>
-      <w:r>
-        <w:rPr>
-          <w:rFonts w:ascii="Times New Roman" w:hAnsi="Times New Roman" w:eastAsia="Times New Roman"/>
-          <w:b w:val="0"/>
-          <w:sz w:val="22"/>
-        </w:rPr>
-        <w:t>Bấm Từ chối thuê → HĐ về Draft phía chủ.</w:t>
-      </w:r>
-    </w:p>
-    <w:p>
-      <w:pPr>
-        <w:pStyle w:val="ListBullet"/>
-      </w:pPr>
-      <w:r>
-        <w:rPr>
-          <w:rFonts w:ascii="Times New Roman" w:hAnsi="Times New Roman" w:eastAsia="Times New Roman"/>
-          <w:b w:val="0"/>
-          <w:sz w:val="22"/>
-        </w:rPr>
-        <w:t>Xác nhận đề xuất sửa HĐ (nếu chủ gửi PendingEdit).</w:t>
-      </w:r>
-    </w:p>
-    <w:p>
-      <w:pPr>
-        <w:pStyle w:val="ListBullet"/>
-      </w:pPr>
-      <w:r>
-        <w:rPr>
-          <w:rFonts w:ascii="Times New Roman" w:hAnsi="Times New Roman" w:eastAsia="Times New Roman"/>
-          <w:b w:val="0"/>
-          <w:sz w:val="22"/>
-        </w:rPr>
-        <w:t>Xin gia hạn / xin hủy (thường qua thông báo cho chủ).</w:t>
-      </w:r>
-    </w:p>
-    <w:p>
-      <w:pPr>
-        <w:pStyle w:val="ListBullet"/>
-      </w:pPr>
-      <w:r>
-        <w:rPr>
-          <w:rFonts w:ascii="Times New Roman" w:hAnsi="Times New Roman" w:eastAsia="Times New Roman"/>
-          <w:b w:val="0"/>
-          <w:sz w:val="22"/>
-        </w:rPr>
-        <w:t>In / xem hợp đồng.</w:t>
-      </w:r>
-    </w:p>
-    <w:p>
-      <w:pPr>
-        <w:pStyle w:val="Heading2"/>
-      </w:pPr>
-      <w:r>
-        <w:rPr>
-          <w:rFonts w:ascii="Times New Roman" w:hAnsi="Times New Roman" w:eastAsia="Times New Roman"/>
-          <w:b/>
-          <w:sz w:val="28"/>
-        </w:rPr>
-        <w:t>4.3. Trong thời gian thuê</w:t>
-      </w:r>
-    </w:p>
-    <w:p>
-      <w:pPr>
-        <w:pStyle w:val="ListBullet"/>
-      </w:pPr>
-      <w:r>
-        <w:rPr>
-          <w:rFonts w:ascii="Times New Roman" w:hAnsi="Times New Roman" w:eastAsia="Times New Roman"/>
-          <w:b w:val="0"/>
-          <w:sz w:val="22"/>
-        </w:rPr>
-        <w:t>Hóa đơn của tôi → xem chi tiết → thanh toán theo UI.</w:t>
-      </w:r>
-    </w:p>
-    <w:p>
-      <w:pPr>
-        <w:pStyle w:val="ListBullet"/>
-      </w:pPr>
-      <w:r>
-        <w:rPr>
-          <w:rFonts w:ascii="Times New Roman" w:hAnsi="Times New Roman" w:eastAsia="Times New Roman"/>
-          <w:b w:val="0"/>
-          <w:sz w:val="22"/>
-        </w:rPr>
-        <w:t>Báo sự cố → theo dõi trạng thái xử lý.</w:t>
-      </w:r>
-    </w:p>
-    <w:p>
-      <w:pPr>
-        <w:pStyle w:val="ListBullet"/>
-      </w:pPr>
-      <w:r>
-        <w:rPr>
-          <w:rFonts w:ascii="Times New Roman" w:hAnsi="Times New Roman" w:eastAsia="Times New Roman"/>
-          <w:b w:val="0"/>
-          <w:sz w:val="22"/>
-        </w:rPr>
-        <w:t>Đánh giá.</w:t>
-      </w:r>
-    </w:p>
-    <w:p>
-      <w:pPr>
-        <w:pStyle w:val="ListBullet"/>
-      </w:pPr>
-      <w:r>
-        <w:rPr>
-          <w:rFonts w:ascii="Times New Roman" w:hAnsi="Times New Roman" w:eastAsia="Times New Roman"/>
-          <w:b w:val="0"/>
-          <w:sz w:val="22"/>
-        </w:rPr>
-        <w:t>Dashboard / Lịch / Hồ sơ / Thông báo.</w:t>
-      </w:r>
-    </w:p>
-    <w:p>
-      <w:pPr>
-        <w:pStyle w:val="Heading1"/>
-      </w:pPr>
-      <w:r>
-        <w:rPr>
-          <w:rFonts w:ascii="Times New Roman" w:hAnsi="Times New Roman" w:eastAsia="Times New Roman"/>
-          <w:b/>
-          <w:sz w:val="32"/>
         </w:rPr>
         <w:t>5. Luồng Manager</w:t>
       </w:r>
@@ -2034,7 +1833,7 @@
           <w:i w:val="0"/>
           <w:sz w:val="22"/>
         </w:rPr>
-        <w:t>Tiền đề: Manager đã được Landlord gán Active cho nhà có hợp đồng Active.</w:t>
+        <w:t>Tiền đề: đã được Landlord gán Active cho nhà có HĐ Active.</w:t>
       </w:r>
     </w:p>
     <w:tbl>
@@ -2044,14 +1843,14 @@
         <w:tblLook w:firstColumn="1" w:firstRow="1" w:lastColumn="0" w:lastRow="0" w:noHBand="0" w:noVBand="1" w:val="04A0"/>
       </w:tblPr>
       <w:tblGrid>
-        <w:gridCol w:w="3230"/>
-        <w:gridCol w:w="3230"/>
-        <w:gridCol w:w="3230"/>
+        <w:gridCol w:w="3249"/>
+        <w:gridCol w:w="3249"/>
+        <w:gridCol w:w="3249"/>
       </w:tblGrid>
       <w:tr>
         <w:tc>
           <w:tcPr>
-            <w:tcW w:type="dxa" w:w="3230"/>
+            <w:tcW w:type="dxa" w:w="3249"/>
           </w:tcPr>
           <w:p>
             <w:r/>
@@ -2067,7 +1866,7 @@
         </w:tc>
         <w:tc>
           <w:tcPr>
-            <w:tcW w:type="dxa" w:w="3230"/>
+            <w:tcW w:type="dxa" w:w="3249"/>
           </w:tcPr>
           <w:p>
             <w:r/>
@@ -2083,7 +1882,7 @@
         </w:tc>
         <w:tc>
           <w:tcPr>
-            <w:tcW w:type="dxa" w:w="3230"/>
+            <w:tcW w:type="dxa" w:w="3249"/>
           </w:tcPr>
           <w:p>
             <w:r/>
@@ -2093,7 +1892,7 @@
                 <w:b/>
                 <w:sz w:val="20"/>
               </w:rPr>
-              <w:t>Luồng thực hiện</w:t>
+              <w:t>Luồng</w:t>
             </w:r>
           </w:p>
         </w:tc>
@@ -2101,7 +1900,7 @@
       <w:tr>
         <w:tc>
           <w:tcPr>
-            <w:tcW w:type="dxa" w:w="3230"/>
+            <w:tcW w:type="dxa" w:w="3249"/>
           </w:tcPr>
           <w:p>
             <w:r/>
@@ -2117,7 +1916,7 @@
         </w:tc>
         <w:tc>
           <w:tcPr>
-            <w:tcW w:type="dxa" w:w="3230"/>
+            <w:tcW w:type="dxa" w:w="3249"/>
           </w:tcPr>
           <w:p>
             <w:r/>
@@ -2127,13 +1926,13 @@
                 <w:b w:val="0"/>
                 <w:sz w:val="20"/>
               </w:rPr>
-              <w:t>Ghi chỉ số điện nước</w:t>
+              <w:t>Ghi chỉ số</w:t>
             </w:r>
           </w:p>
         </w:tc>
         <w:tc>
           <w:tcPr>
-            <w:tcW w:type="dxa" w:w="3230"/>
+            <w:tcW w:type="dxa" w:w="3249"/>
           </w:tcPr>
           <w:p>
             <w:r/>
@@ -2143,7 +1942,7 @@
                 <w:b w:val="0"/>
                 <w:sz w:val="20"/>
               </w:rPr>
-              <w:t>Chọn HĐ/phòng thuộc nhà được gán → nhập chỉ số → tạo/cập nhật hóa đơn.</w:t>
+              <w:t>Chọn HĐ/phòng thuộc nhà được gán → nhập chỉ số → hóa đơn</w:t>
             </w:r>
           </w:p>
         </w:tc>
@@ -2151,7 +1950,7 @@
       <w:tr>
         <w:tc>
           <w:tcPr>
-            <w:tcW w:type="dxa" w:w="3230"/>
+            <w:tcW w:type="dxa" w:w="3249"/>
           </w:tcPr>
           <w:p>
             <w:r/>
@@ -2167,7 +1966,7 @@
         </w:tc>
         <w:tc>
           <w:tcPr>
-            <w:tcW w:type="dxa" w:w="3230"/>
+            <w:tcW w:type="dxa" w:w="3249"/>
           </w:tcPr>
           <w:p>
             <w:r/>
@@ -2177,13 +1976,13 @@
                 <w:b w:val="0"/>
                 <w:sz w:val="20"/>
               </w:rPr>
-              <w:t>Quản lý sự cố</w:t>
+              <w:t>Sự cố</w:t>
             </w:r>
           </w:p>
         </w:tc>
         <w:tc>
           <w:tcPr>
-            <w:tcW w:type="dxa" w:w="3230"/>
+            <w:tcW w:type="dxa" w:w="3249"/>
           </w:tcPr>
           <w:p>
             <w:r/>
@@ -2193,7 +1992,7 @@
                 <w:b w:val="0"/>
                 <w:sz w:val="20"/>
               </w:rPr>
-              <w:t>Xem request thuộc nhà được gán → nhận xử lý / cập nhật trạng thái.</w:t>
+              <w:t>Xem request → cập nhật trạng thái</w:t>
             </w:r>
           </w:p>
         </w:tc>
@@ -2201,7 +2000,7 @@
       <w:tr>
         <w:tc>
           <w:tcPr>
-            <w:tcW w:type="dxa" w:w="3230"/>
+            <w:tcW w:type="dxa" w:w="3249"/>
           </w:tcPr>
           <w:p>
             <w:r/>
@@ -2217,7 +2016,7 @@
         </w:tc>
         <w:tc>
           <w:tcPr>
-            <w:tcW w:type="dxa" w:w="3230"/>
+            <w:tcW w:type="dxa" w:w="3249"/>
           </w:tcPr>
           <w:p>
             <w:r/>
@@ -2227,13 +2026,13 @@
                 <w:b w:val="0"/>
                 <w:sz w:val="20"/>
               </w:rPr>
-              <w:t>Dashboard / Lịch / TB</w:t>
+              <w:t>Dashboard</w:t>
             </w:r>
           </w:p>
         </w:tc>
         <w:tc>
           <w:tcPr>
-            <w:tcW w:type="dxa" w:w="3230"/>
+            <w:tcW w:type="dxa" w:w="3249"/>
           </w:tcPr>
           <w:p>
             <w:r/>
@@ -2243,7 +2042,7 @@
                 <w:b w:val="0"/>
                 <w:sz w:val="20"/>
               </w:rPr>
-              <w:t>Theo dõi KPI phòng, bảo trì pending, hóa đơn chưa trả…</w:t>
+              <w:t>KPI phòng / bảo trì / hóa đơn chưa trả</w:t>
             </w:r>
           </w:p>
         </w:tc>
@@ -2252,29 +2051,93 @@
     <w:p/>
     <w:p>
       <w:pPr>
-        <w:spacing w:after="120" w:line="276" w:lineRule="auto"/>
+        <w:pStyle w:val="Heading2"/>
+      </w:pPr>
+      <w:r>
+        <w:rPr>
+          <w:rFonts w:ascii="Times New Roman" w:hAnsi="Times New Roman" w:eastAsia="Times New Roman"/>
+          <w:b/>
+          <w:sz w:val="28"/>
+        </w:rPr>
+        <w:t>6. Luồng cắt ngang</w:t>
+      </w:r>
+    </w:p>
+    <w:p>
+      <w:pPr>
+        <w:pStyle w:val="ListBullet"/>
       </w:pPr>
       <w:r>
         <w:rPr>
           <w:rFonts w:ascii="Times New Roman" w:hAnsi="Times New Roman" w:eastAsia="Times New Roman"/>
           <w:b w:val="0"/>
-          <w:i/>
           <w:sz w:val="22"/>
         </w:rPr>
-        <w:t>Manager không tự gán nhà và không tạo hợp đồng thuê.</w:t>
+        <w:t>Tin: Chủ Pending → Admin duyệt/từ chối + TB → public nếu Approved.</w:t>
       </w:r>
     </w:p>
     <w:p>
       <w:pPr>
-        <w:pStyle w:val="Heading1"/>
+        <w:pStyle w:val="ListBullet"/>
       </w:pPr>
       <w:r>
         <w:rPr>
           <w:rFonts w:ascii="Times New Roman" w:hAnsi="Times New Roman" w:eastAsia="Times New Roman"/>
-          <w:b/>
-          <w:sz w:val="32"/>
+          <w:b w:val="0"/>
+          <w:sz w:val="22"/>
         </w:rPr>
-        <w:t>6. Luồng cắt ngang (theo nghiệp vụ)</w:t>
+        <w:t>Hẹn: Khách đặt → Chủ duyệt → xem phòng → tạo/gán HĐ.</w:t>
+      </w:r>
+    </w:p>
+    <w:p>
+      <w:pPr>
+        <w:pStyle w:val="ListBullet"/>
+      </w:pPr>
+      <w:r>
+        <w:rPr>
+          <w:rFonts w:ascii="Times New Roman" w:hAnsi="Times New Roman" w:eastAsia="Times New Roman"/>
+          <w:b w:val="0"/>
+          <w:sz w:val="22"/>
+        </w:rPr>
+        <w:t>HĐ: PendingConfirm → Đồng ý/Từ chối + TB hai chiều.</w:t>
+      </w:r>
+    </w:p>
+    <w:p>
+      <w:pPr>
+        <w:pStyle w:val="ListBullet"/>
+      </w:pPr>
+      <w:r>
+        <w:rPr>
+          <w:rFonts w:ascii="Times New Roman" w:hAnsi="Times New Roman" w:eastAsia="Times New Roman"/>
+          <w:b w:val="0"/>
+          <w:sz w:val="22"/>
+        </w:rPr>
+        <w:t>Hóa đơn: Manager ghi chỉ số → Unpaid → Khách trả.</w:t>
+      </w:r>
+    </w:p>
+    <w:p>
+      <w:pPr>
+        <w:pStyle w:val="ListBullet"/>
+      </w:pPr>
+      <w:r>
+        <w:rPr>
+          <w:rFonts w:ascii="Times New Roman" w:hAnsi="Times New Roman" w:eastAsia="Times New Roman"/>
+          <w:b w:val="0"/>
+          <w:sz w:val="22"/>
+        </w:rPr>
+        <w:t>Sự cố: Khách báo → Manager xử lý.</w:t>
+      </w:r>
+    </w:p>
+    <w:p>
+      <w:pPr>
+        <w:pStyle w:val="ListBullet"/>
+      </w:pPr>
+      <w:r>
+        <w:rPr>
+          <w:rFonts w:ascii="Times New Roman" w:hAnsi="Times New Roman" w:eastAsia="Times New Roman"/>
+          <w:b w:val="0"/>
+          <w:sz w:val="22"/>
+        </w:rPr>
+        <w:t>Review / Notification / ActivityLog theo hành động quan trọng.</w:t>
       </w:r>
     </w:p>
     <w:p>
@@ -2287,299 +2150,7 @@
           <w:b/>
           <w:sz w:val="28"/>
         </w:rPr>
-        <w:t>6.1. Tin đăng</w:t>
-      </w:r>
-    </w:p>
-    <w:p>
-      <w:pPr>
-        <w:spacing w:after="120" w:line="276" w:lineRule="auto"/>
-      </w:pPr>
-      <w:r>
-        <w:rPr>
-          <w:rFonts w:ascii="Times New Roman" w:hAnsi="Times New Roman" w:eastAsia="Times New Roman"/>
-          <w:b w:val="0"/>
-          <w:i w:val="0"/>
-          <w:sz w:val="22"/>
-        </w:rPr>
-        <w:t>Chủ tạo (Pending) → Admin duyệt → Khách thấy ở Tìm phòng. Nếu từ chối thì không public.</w:t>
-      </w:r>
-    </w:p>
-    <w:p>
-      <w:pPr>
-        <w:pStyle w:val="Heading2"/>
-      </w:pPr>
-      <w:r>
-        <w:rPr>
-          <w:rFonts w:ascii="Times New Roman" w:hAnsi="Times New Roman" w:eastAsia="Times New Roman"/>
-          <w:b/>
-          <w:sz w:val="28"/>
-        </w:rPr>
-        <w:t>6.2. Lịch hẹn</w:t>
-      </w:r>
-    </w:p>
-    <w:p>
-      <w:pPr>
-        <w:spacing w:after="120" w:line="276" w:lineRule="auto"/>
-      </w:pPr>
-      <w:r>
-        <w:rPr>
-          <w:rFonts w:ascii="Times New Roman" w:hAnsi="Times New Roman" w:eastAsia="Times New Roman"/>
-          <w:b w:val="0"/>
-          <w:i w:val="0"/>
-          <w:sz w:val="22"/>
-        </w:rPr>
-        <w:t>Khách đặt → Chủ duyệt → Xem phòng → (sau đó) Chủ tạo/gán hợp đồng.</w:t>
-      </w:r>
-    </w:p>
-    <w:p>
-      <w:pPr>
-        <w:pStyle w:val="Heading2"/>
-      </w:pPr>
-      <w:r>
-        <w:rPr>
-          <w:rFonts w:ascii="Times New Roman" w:hAnsi="Times New Roman" w:eastAsia="Times New Roman"/>
-          <w:b/>
-          <w:sz w:val="28"/>
-        </w:rPr>
-        <w:t>6.3. Hóa đơn điện/nước</w:t>
-      </w:r>
-    </w:p>
-    <w:p>
-      <w:pPr>
-        <w:spacing w:after="120" w:line="276" w:lineRule="auto"/>
-      </w:pPr>
-      <w:r>
-        <w:rPr>
-          <w:rFonts w:ascii="Times New Roman" w:hAnsi="Times New Roman" w:eastAsia="Times New Roman"/>
-          <w:b w:val="0"/>
-          <w:i w:val="0"/>
-          <w:sz w:val="22"/>
-        </w:rPr>
-        <w:t>Manager ghi chỉ số → Hóa đơn Unpaid → Khách thanh toán → (có thể) thông báo chủ.</w:t>
-      </w:r>
-    </w:p>
-    <w:p>
-      <w:pPr>
-        <w:pStyle w:val="Heading2"/>
-      </w:pPr>
-      <w:r>
-        <w:rPr>
-          <w:rFonts w:ascii="Times New Roman" w:hAnsi="Times New Roman" w:eastAsia="Times New Roman"/>
-          <w:b/>
-          <w:sz w:val="28"/>
-        </w:rPr>
-        <w:t>6.4. Bảo trì / sự cố</w:t>
-      </w:r>
-    </w:p>
-    <w:p>
-      <w:pPr>
-        <w:spacing w:after="120" w:line="276" w:lineRule="auto"/>
-      </w:pPr>
-      <w:r>
-        <w:rPr>
-          <w:rFonts w:ascii="Times New Roman" w:hAnsi="Times New Roman" w:eastAsia="Times New Roman"/>
-          <w:b w:val="0"/>
-          <w:i w:val="0"/>
-          <w:sz w:val="22"/>
-        </w:rPr>
-        <w:t>Khách báo → Manager xử lý (nếu được gán nhà đó); chủ theo dõi qua Dashboard/Thông báo.</w:t>
-      </w:r>
-    </w:p>
-    <w:p>
-      <w:pPr>
-        <w:pStyle w:val="Heading2"/>
-      </w:pPr>
-      <w:r>
-        <w:rPr>
-          <w:rFonts w:ascii="Times New Roman" w:hAnsi="Times New Roman" w:eastAsia="Times New Roman"/>
-          <w:b/>
-          <w:sz w:val="28"/>
-        </w:rPr>
-        <w:t>6.5. Đánh giá</w:t>
-      </w:r>
-    </w:p>
-    <w:p>
-      <w:pPr>
-        <w:spacing w:after="120" w:line="276" w:lineRule="auto"/>
-      </w:pPr>
-      <w:r>
-        <w:rPr>
-          <w:rFonts w:ascii="Times New Roman" w:hAnsi="Times New Roman" w:eastAsia="Times New Roman"/>
-          <w:b w:val="0"/>
-          <w:i w:val="0"/>
-          <w:sz w:val="22"/>
-        </w:rPr>
-        <w:t>Khách tạo / hệ thống ghi nhận → Chủ xem → Admin quản trị khi cần.</w:t>
-      </w:r>
-    </w:p>
-    <w:p>
-      <w:pPr>
-        <w:pStyle w:val="Heading2"/>
-      </w:pPr>
-      <w:r>
-        <w:rPr>
-          <w:rFonts w:ascii="Times New Roman" w:hAnsi="Times New Roman" w:eastAsia="Times New Roman"/>
-          <w:b/>
-          <w:sz w:val="28"/>
-        </w:rPr>
-        <w:t>6.6. Thông báo và nhật ký</w:t>
-      </w:r>
-    </w:p>
-    <w:p>
-      <w:pPr>
-        <w:spacing w:after="120" w:line="276" w:lineRule="auto"/>
-      </w:pPr>
-      <w:r>
-        <w:rPr>
-          <w:rFonts w:ascii="Times New Roman" w:hAnsi="Times New Roman" w:eastAsia="Times New Roman"/>
-          <w:b w:val="0"/>
-          <w:i w:val="0"/>
-          <w:sz w:val="22"/>
-        </w:rPr>
-        <w:t>Các hành động quan trọng (gán khách, đồng ý thuê, gán Manager, duyệt tin…) tạo Notification; một phần ghi ActivityLog.</w:t>
-      </w:r>
-    </w:p>
-    <w:p>
-      <w:pPr>
-        <w:pStyle w:val="Heading1"/>
-      </w:pPr>
-      <w:r>
-        <w:rPr>
-          <w:rFonts w:ascii="Times New Roman" w:hAnsi="Times New Roman" w:eastAsia="Times New Roman"/>
-          <w:b/>
-          <w:sz w:val="32"/>
-        </w:rPr>
-        <w:t>7. Thứ tự demo khuyến nghị</w:t>
-      </w:r>
-    </w:p>
-    <w:p>
-      <w:pPr>
-        <w:pStyle w:val="ListBullet"/>
-      </w:pPr>
-      <w:r>
-        <w:rPr>
-          <w:rFonts w:ascii="Times New Roman" w:hAnsi="Times New Roman" w:eastAsia="Times New Roman"/>
-          <w:b w:val="0"/>
-          <w:sz w:val="22"/>
-        </w:rPr>
-        <w:t>1. Login admin → duyệt user (nếu Pending) / duyệt tin.</w:t>
-      </w:r>
-    </w:p>
-    <w:p>
-      <w:pPr>
-        <w:pStyle w:val="ListBullet"/>
-      </w:pPr>
-      <w:r>
-        <w:rPr>
-          <w:rFonts w:ascii="Times New Roman" w:hAnsi="Times New Roman" w:eastAsia="Times New Roman"/>
-          <w:b w:val="0"/>
-          <w:sz w:val="22"/>
-        </w:rPr>
-        <w:t>2. Login landlord demo → Nhà → Phòng → Đăng tin.</w:t>
-      </w:r>
-    </w:p>
-    <w:p>
-      <w:pPr>
-        <w:pStyle w:val="ListBullet"/>
-      </w:pPr>
-      <w:r>
-        <w:rPr>
-          <w:rFonts w:ascii="Times New Roman" w:hAnsi="Times New Roman" w:eastAsia="Times New Roman"/>
-          <w:b w:val="0"/>
-          <w:sz w:val="22"/>
-        </w:rPr>
-        <w:t>3. Admin duyệt tin.</w:t>
-      </w:r>
-    </w:p>
-    <w:p>
-      <w:pPr>
-        <w:pStyle w:val="ListBullet"/>
-      </w:pPr>
-      <w:r>
-        <w:rPr>
-          <w:rFonts w:ascii="Times New Roman" w:hAnsi="Times New Roman" w:eastAsia="Times New Roman"/>
-          <w:b w:val="0"/>
-          <w:sz w:val="22"/>
-        </w:rPr>
-        <w:t>4. Login tenant → Tìm phòng → Đặt hẹn.</w:t>
-      </w:r>
-    </w:p>
-    <w:p>
-      <w:pPr>
-        <w:pStyle w:val="ListBullet"/>
-      </w:pPr>
-      <w:r>
-        <w:rPr>
-          <w:rFonts w:ascii="Times New Roman" w:hAnsi="Times New Roman" w:eastAsia="Times New Roman"/>
-          <w:b w:val="0"/>
-          <w:sz w:val="22"/>
-        </w:rPr>
-        <w:t>5. Landlord xác nhận hẹn → Hợp đồng → gán khách → thấy «Chờ khách xác nhận».</w:t>
-      </w:r>
-    </w:p>
-    <w:p>
-      <w:pPr>
-        <w:pStyle w:val="ListBullet"/>
-      </w:pPr>
-      <w:r>
-        <w:rPr>
-          <w:rFonts w:ascii="Times New Roman" w:hAnsi="Times New Roman" w:eastAsia="Times New Roman"/>
-          <w:b w:val="0"/>
-          <w:sz w:val="22"/>
-        </w:rPr>
-        <w:t>6. Tenant → Đồng ý thuê → Dashboard chủ «Đã thuê» +1.</w:t>
-      </w:r>
-    </w:p>
-    <w:p>
-      <w:pPr>
-        <w:pStyle w:val="ListBullet"/>
-      </w:pPr>
-      <w:r>
-        <w:rPr>
-          <w:rFonts w:ascii="Times New Roman" w:hAnsi="Times New Roman" w:eastAsia="Times New Roman"/>
-          <w:b w:val="0"/>
-          <w:sz w:val="22"/>
-        </w:rPr>
-        <w:t>7. Landlord → Phân công Manager (username manager / ID demo).</w:t>
-      </w:r>
-    </w:p>
-    <w:p>
-      <w:pPr>
-        <w:pStyle w:val="ListBullet"/>
-      </w:pPr>
-      <w:r>
-        <w:rPr>
-          <w:rFonts w:ascii="Times New Roman" w:hAnsi="Times New Roman" w:eastAsia="Times New Roman"/>
-          <w:b w:val="0"/>
-          <w:sz w:val="22"/>
-        </w:rPr>
-        <w:t>8. Login manager → Ghi chỉ số → tạo hóa đơn.</w:t>
-      </w:r>
-    </w:p>
-    <w:p>
-      <w:pPr>
-        <w:pStyle w:val="ListBullet"/>
-      </w:pPr>
-      <w:r>
-        <w:rPr>
-          <w:rFonts w:ascii="Times New Roman" w:hAnsi="Times New Roman" w:eastAsia="Times New Roman"/>
-          <w:b w:val="0"/>
-          <w:sz w:val="22"/>
-        </w:rPr>
-        <w:t>9. Tenant → xem/thanh toán hóa đơn; báo sự cố → Manager xử lý.</w:t>
-      </w:r>
-    </w:p>
-    <w:p>
-      <w:pPr>
-        <w:pStyle w:val="Heading1"/>
-      </w:pPr>
-      <w:r>
-        <w:rPr>
-          <w:rFonts w:ascii="Times New Roman" w:hAnsi="Times New Roman" w:eastAsia="Times New Roman"/>
-          <w:b/>
-          <w:sz w:val="32"/>
-        </w:rPr>
-        <w:t>8. Bản đồ menu theo vai trò</w:t>
+        <w:t>7. Bản đồ menu</w:t>
       </w:r>
     </w:p>
     <w:tbl>
@@ -2589,13 +2160,13 @@
         <w:tblLook w:firstColumn="1" w:firstRow="1" w:lastColumn="0" w:lastRow="0" w:noHBand="0" w:noVBand="1" w:val="04A0"/>
       </w:tblPr>
       <w:tblGrid>
-        <w:gridCol w:w="4844"/>
-        <w:gridCol w:w="4844"/>
+        <w:gridCol w:w="4873"/>
+        <w:gridCol w:w="4873"/>
       </w:tblGrid>
       <w:tr>
         <w:tc>
           <w:tcPr>
-            <w:tcW w:type="dxa" w:w="4844"/>
+            <w:tcW w:type="dxa" w:w="4873"/>
           </w:tcPr>
           <w:p>
             <w:r/>
@@ -2611,7 +2182,7 @@
         </w:tc>
         <w:tc>
           <w:tcPr>
-            <w:tcW w:type="dxa" w:w="4844"/>
+            <w:tcW w:type="dxa" w:w="4873"/>
           </w:tcPr>
           <w:p>
             <w:r/>
@@ -2621,7 +2192,7 @@
                 <w:b/>
                 <w:sz w:val="20"/>
               </w:rPr>
-              <w:t>Menu chức năng</w:t>
+              <w:t>Menu</w:t>
             </w:r>
           </w:p>
         </w:tc>
@@ -2629,7 +2200,7 @@
       <w:tr>
         <w:tc>
           <w:tcPr>
-            <w:tcW w:type="dxa" w:w="4844"/>
+            <w:tcW w:type="dxa" w:w="4873"/>
           </w:tcPr>
           <w:p>
             <w:r/>
@@ -2645,7 +2216,7 @@
         </w:tc>
         <w:tc>
           <w:tcPr>
-            <w:tcW w:type="dxa" w:w="4844"/>
+            <w:tcW w:type="dxa" w:w="4873"/>
           </w:tcPr>
           <w:p>
             <w:r/>
@@ -2655,7 +2226,7 @@
                 <w:b w:val="0"/>
                 <w:sz w:val="20"/>
               </w:rPr>
-              <w:t>Dashboard, Thông báo, Hồ sơ, Lịch, Báo cáo, Quản lý người dùng, Quản lý tin đăng, Đánh giá, Nhật ký hệ thống, Backup DB</w:t>
+              <w:t>Dashboard, TB, Hồ sơ, Lịch, Báo cáo, User, Tin, Review, Log, Backup</w:t>
             </w:r>
           </w:p>
         </w:tc>
@@ -2663,7 +2234,7 @@
       <w:tr>
         <w:tc>
           <w:tcPr>
-            <w:tcW w:type="dxa" w:w="4844"/>
+            <w:tcW w:type="dxa" w:w="4873"/>
           </w:tcPr>
           <w:p>
             <w:r/>
@@ -2679,7 +2250,7 @@
         </w:tc>
         <w:tc>
           <w:tcPr>
-            <w:tcW w:type="dxa" w:w="4844"/>
+            <w:tcW w:type="dxa" w:w="4873"/>
           </w:tcPr>
           <w:p>
             <w:r/>
@@ -2689,7 +2260,7 @@
                 <w:b w:val="0"/>
                 <w:sz w:val="20"/>
               </w:rPr>
-              <w:t>Dashboard, Thông báo, Hồ sơ, Lịch, Báo cáo, Chat, Nhà của tôi, Phòng của tôi, Phân công Manager, Hợp đồng, Lịch hẹn xem phòng, Đăng tin mới, Đánh giá</w:t>
+              <w:t>Dashboard, TB, Hồ sơ, Lịch, Báo cáo, Chat, Nhà, Phòng, Gán Manager, HĐ, Hẹn, Tin, Review</w:t>
             </w:r>
           </w:p>
         </w:tc>
@@ -2697,7 +2268,7 @@
       <w:tr>
         <w:tc>
           <w:tcPr>
-            <w:tcW w:type="dxa" w:w="4844"/>
+            <w:tcW w:type="dxa" w:w="4873"/>
           </w:tcPr>
           <w:p>
             <w:r/>
@@ -2713,7 +2284,7 @@
         </w:tc>
         <w:tc>
           <w:tcPr>
-            <w:tcW w:type="dxa" w:w="4844"/>
+            <w:tcW w:type="dxa" w:w="4873"/>
           </w:tcPr>
           <w:p>
             <w:r/>
@@ -2723,7 +2294,7 @@
                 <w:b w:val="0"/>
                 <w:sz w:val="20"/>
               </w:rPr>
-              <w:t>Dashboard, Thông báo, Hồ sơ, Lịch, Chat, Tìm phòng, Yêu thích, Hợp đồng của tôi, Hóa đơn của tôi, Báo sự cố, Đánh giá</w:t>
+              <w:t>Dashboard, TB, Hồ sơ, Lịch, Chat, Tìm phòng, Yêu thích, HĐ, Hóa đơn, Sự cố, Review</w:t>
             </w:r>
           </w:p>
         </w:tc>
@@ -2731,7 +2302,7 @@
       <w:tr>
         <w:tc>
           <w:tcPr>
-            <w:tcW w:type="dxa" w:w="4844"/>
+            <w:tcW w:type="dxa" w:w="4873"/>
           </w:tcPr>
           <w:p>
             <w:r/>
@@ -2747,7 +2318,7 @@
         </w:tc>
         <w:tc>
           <w:tcPr>
-            <w:tcW w:type="dxa" w:w="4844"/>
+            <w:tcW w:type="dxa" w:w="4873"/>
           </w:tcPr>
           <w:p>
             <w:r/>
@@ -2757,7 +2328,7 @@
                 <w:b w:val="0"/>
                 <w:sz w:val="20"/>
               </w:rPr>
-              <w:t>Dashboard, Thông báo, Hồ sơ, Lịch, Ghi chỉ số điện nước, Quản lý sự cố</w:t>
+              <w:t>Dashboard, TB, Hồ sơ, Lịch, Ghi chỉ số, Sự cố</w:t>
             </w:r>
           </w:p>
         </w:tc>
@@ -2766,305 +2337,15 @@
     <w:p/>
     <w:p>
       <w:pPr>
-        <w:pStyle w:val="Heading1"/>
+        <w:pStyle w:val="Heading2"/>
       </w:pPr>
       <w:r>
         <w:rPr>
           <w:rFonts w:ascii="Times New Roman" w:hAnsi="Times New Roman" w:eastAsia="Times New Roman"/>
           <w:b/>
-          <w:sz w:val="32"/>
+          <w:sz w:val="28"/>
         </w:rPr>
-        <w:t>9. Tài khoản demo tham chiếu</w:t>
-      </w:r>
-    </w:p>
-    <w:tbl>
-      <w:tblPr>
-        <w:tblStyle w:val="TableGrid"/>
-        <w:tblW w:type="auto" w:w="0"/>
-        <w:tblLook w:firstColumn="1" w:firstRow="1" w:lastColumn="0" w:lastRow="0" w:noHBand="0" w:noVBand="1" w:val="04A0"/>
-      </w:tblPr>
-      <w:tblGrid>
-        <w:gridCol w:w="3230"/>
-        <w:gridCol w:w="3230"/>
-        <w:gridCol w:w="3230"/>
-      </w:tblGrid>
-      <w:tr>
-        <w:tc>
-          <w:tcPr>
-            <w:tcW w:type="dxa" w:w="3230"/>
-          </w:tcPr>
-          <w:p>
-            <w:r/>
-            <w:r>
-              <w:rPr>
-                <w:rFonts w:ascii="Times New Roman" w:hAnsi="Times New Roman" w:eastAsia="Times New Roman"/>
-                <w:b/>
-                <w:sz w:val="20"/>
-              </w:rPr>
-              <w:t>Username</w:t>
-            </w:r>
-          </w:p>
-        </w:tc>
-        <w:tc>
-          <w:tcPr>
-            <w:tcW w:type="dxa" w:w="3230"/>
-          </w:tcPr>
-          <w:p>
-            <w:r/>
-            <w:r>
-              <w:rPr>
-                <w:rFonts w:ascii="Times New Roman" w:hAnsi="Times New Roman" w:eastAsia="Times New Roman"/>
-                <w:b/>
-                <w:sz w:val="20"/>
-              </w:rPr>
-              <w:t>Password (tham chiếu)</w:t>
-            </w:r>
-          </w:p>
-        </w:tc>
-        <w:tc>
-          <w:tcPr>
-            <w:tcW w:type="dxa" w:w="3230"/>
-          </w:tcPr>
-          <w:p>
-            <w:r/>
-            <w:r>
-              <w:rPr>
-                <w:rFonts w:ascii="Times New Roman" w:hAnsi="Times New Roman" w:eastAsia="Times New Roman"/>
-                <w:b/>
-                <w:sz w:val="20"/>
-              </w:rPr>
-              <w:t>Role</w:t>
-            </w:r>
-          </w:p>
-        </w:tc>
-      </w:tr>
-      <w:tr>
-        <w:tc>
-          <w:tcPr>
-            <w:tcW w:type="dxa" w:w="3230"/>
-          </w:tcPr>
-          <w:p>
-            <w:r/>
-            <w:r>
-              <w:rPr>
-                <w:rFonts w:ascii="Times New Roman" w:hAnsi="Times New Roman" w:eastAsia="Times New Roman"/>
-                <w:b w:val="0"/>
-                <w:sz w:val="20"/>
-              </w:rPr>
-              <w:t>admin</w:t>
-            </w:r>
-          </w:p>
-        </w:tc>
-        <w:tc>
-          <w:tcPr>
-            <w:tcW w:type="dxa" w:w="3230"/>
-          </w:tcPr>
-          <w:p>
-            <w:r/>
-            <w:r>
-              <w:rPr>
-                <w:rFonts w:ascii="Times New Roman" w:hAnsi="Times New Roman" w:eastAsia="Times New Roman"/>
-                <w:b w:val="0"/>
-                <w:sz w:val="20"/>
-              </w:rPr>
-              <w:t>admin123 / theo seed</w:t>
-            </w:r>
-          </w:p>
-        </w:tc>
-        <w:tc>
-          <w:tcPr>
-            <w:tcW w:type="dxa" w:w="3230"/>
-          </w:tcPr>
-          <w:p>
-            <w:r/>
-            <w:r>
-              <w:rPr>
-                <w:rFonts w:ascii="Times New Roman" w:hAnsi="Times New Roman" w:eastAsia="Times New Roman"/>
-                <w:b w:val="0"/>
-                <w:sz w:val="20"/>
-              </w:rPr>
-              <w:t>Admin</w:t>
-            </w:r>
-          </w:p>
-        </w:tc>
-      </w:tr>
-      <w:tr>
-        <w:tc>
-          <w:tcPr>
-            <w:tcW w:type="dxa" w:w="3230"/>
-          </w:tcPr>
-          <w:p>
-            <w:r/>
-            <w:r>
-              <w:rPr>
-                <w:rFonts w:ascii="Times New Roman" w:hAnsi="Times New Roman" w:eastAsia="Times New Roman"/>
-                <w:b w:val="0"/>
-                <w:sz w:val="20"/>
-              </w:rPr>
-              <w:t>namlandlord / landlord1</w:t>
-            </w:r>
-          </w:p>
-        </w:tc>
-        <w:tc>
-          <w:tcPr>
-            <w:tcW w:type="dxa" w:w="3230"/>
-          </w:tcPr>
-          <w:p>
-            <w:r/>
-            <w:r>
-              <w:rPr>
-                <w:rFonts w:ascii="Times New Roman" w:hAnsi="Times New Roman" w:eastAsia="Times New Roman"/>
-                <w:b w:val="0"/>
-                <w:sz w:val="20"/>
-              </w:rPr>
-              <w:t>123456</w:t>
-            </w:r>
-          </w:p>
-        </w:tc>
-        <w:tc>
-          <w:tcPr>
-            <w:tcW w:type="dxa" w:w="3230"/>
-          </w:tcPr>
-          <w:p>
-            <w:r/>
-            <w:r>
-              <w:rPr>
-                <w:rFonts w:ascii="Times New Roman" w:hAnsi="Times New Roman" w:eastAsia="Times New Roman"/>
-                <w:b w:val="0"/>
-                <w:sz w:val="20"/>
-              </w:rPr>
-              <w:t>Landlord</w:t>
-            </w:r>
-          </w:p>
-        </w:tc>
-      </w:tr>
-      <w:tr>
-        <w:tc>
-          <w:tcPr>
-            <w:tcW w:type="dxa" w:w="3230"/>
-          </w:tcPr>
-          <w:p>
-            <w:r/>
-            <w:r>
-              <w:rPr>
-                <w:rFonts w:ascii="Times New Roman" w:hAnsi="Times New Roman" w:eastAsia="Times New Roman"/>
-                <w:b w:val="0"/>
-                <w:sz w:val="20"/>
-              </w:rPr>
-              <w:t>tenant / tenant1</w:t>
-            </w:r>
-          </w:p>
-        </w:tc>
-        <w:tc>
-          <w:tcPr>
-            <w:tcW w:type="dxa" w:w="3230"/>
-          </w:tcPr>
-          <w:p>
-            <w:r/>
-            <w:r>
-              <w:rPr>
-                <w:rFonts w:ascii="Times New Roman" w:hAnsi="Times New Roman" w:eastAsia="Times New Roman"/>
-                <w:b w:val="0"/>
-                <w:sz w:val="20"/>
-              </w:rPr>
-              <w:t>123456</w:t>
-            </w:r>
-          </w:p>
-        </w:tc>
-        <w:tc>
-          <w:tcPr>
-            <w:tcW w:type="dxa" w:w="3230"/>
-          </w:tcPr>
-          <w:p>
-            <w:r/>
-            <w:r>
-              <w:rPr>
-                <w:rFonts w:ascii="Times New Roman" w:hAnsi="Times New Roman" w:eastAsia="Times New Roman"/>
-                <w:b w:val="0"/>
-                <w:sz w:val="20"/>
-              </w:rPr>
-              <w:t>Tenant</w:t>
-            </w:r>
-          </w:p>
-        </w:tc>
-      </w:tr>
-      <w:tr>
-        <w:tc>
-          <w:tcPr>
-            <w:tcW w:type="dxa" w:w="3230"/>
-          </w:tcPr>
-          <w:p>
-            <w:r/>
-            <w:r>
-              <w:rPr>
-                <w:rFonts w:ascii="Times New Roman" w:hAnsi="Times New Roman" w:eastAsia="Times New Roman"/>
-                <w:b w:val="0"/>
-                <w:sz w:val="20"/>
-              </w:rPr>
-              <w:t>manager / manager1</w:t>
-            </w:r>
-          </w:p>
-        </w:tc>
-        <w:tc>
-          <w:tcPr>
-            <w:tcW w:type="dxa" w:w="3230"/>
-          </w:tcPr>
-          <w:p>
-            <w:r/>
-            <w:r>
-              <w:rPr>
-                <w:rFonts w:ascii="Times New Roman" w:hAnsi="Times New Roman" w:eastAsia="Times New Roman"/>
-                <w:b w:val="0"/>
-                <w:sz w:val="20"/>
-              </w:rPr>
-              <w:t>123456</w:t>
-            </w:r>
-          </w:p>
-        </w:tc>
-        <w:tc>
-          <w:tcPr>
-            <w:tcW w:type="dxa" w:w="3230"/>
-          </w:tcPr>
-          <w:p>
-            <w:r/>
-            <w:r>
-              <w:rPr>
-                <w:rFonts w:ascii="Times New Roman" w:hAnsi="Times New Roman" w:eastAsia="Times New Roman"/>
-                <w:b w:val="0"/>
-                <w:sz w:val="20"/>
-              </w:rPr>
-              <w:t>Manager</w:t>
-            </w:r>
-          </w:p>
-        </w:tc>
-      </w:tr>
-    </w:tbl>
-    <w:p/>
-    <w:p>
-      <w:pPr>
-        <w:spacing w:after="120" w:line="276" w:lineRule="auto"/>
-      </w:pPr>
-      <w:r>
-        <w:rPr>
-          <w:rFonts w:ascii="Times New Roman" w:hAnsi="Times New Roman" w:eastAsia="Times New Roman"/>
-          <w:b w:val="0"/>
-          <w:i/>
-          <w:sz w:val="22"/>
-        </w:rPr>
-        <w:t>Lưu ý: mật khẩu chính xác theo DataSeeder / môi trường DB đang chạy.</w:t>
-      </w:r>
-    </w:p>
-    <w:p>
-      <w:pPr>
-        <w:pStyle w:val="Heading1"/>
-      </w:pPr>
-      <w:r>
-        <w:rPr>
-          <w:rFonts w:ascii="Times New Roman" w:hAnsi="Times New Roman" w:eastAsia="Times New Roman"/>
-          <w:b/>
-          <w:sz w:val="32"/>
-        </w:rPr>
-        <w:t>10. Ghi chú kỹ thuật ngắn</w:t>
+        <w:t>8. Ghi chú kỹ thuật</w:t>
       </w:r>
     </w:p>
     <w:p>
@@ -3077,7 +2358,7 @@
           <w:b w:val="0"/>
           <w:sz w:val="22"/>
         </w:rPr>
-        <w:t>Kiến trúc: WinForms → BLL (Service) → DAL (EF Core) → SQL Server.</w:t>
+        <w:t>Kiến trúc: WinForms → BLL → DAL (EF Core) → SQL Server.</w:t>
       </w:r>
     </w:p>
     <w:p>
@@ -3090,7 +2371,7 @@
           <w:b w:val="0"/>
           <w:sz w:val="22"/>
         </w:rPr>
-        <w:t>Trạng thái HĐ hợp lệ: Draft, PendingConfirm, Active, Expired, Terminated.</w:t>
+        <w:t>HĐ: Draft, PendingConfirm, Active, Expired, Terminated.</w:t>
       </w:r>
     </w:p>
     <w:p>
@@ -3103,7 +2384,7 @@
           <w:b w:val="0"/>
           <w:sz w:val="22"/>
         </w:rPr>
-        <w:t>DatabaseSchemaUpdater cập nhật CHECK constraint khi khởi động app.</w:t>
+        <w:t>Tin: Pending, Approved, Rejected.</w:t>
       </w:r>
     </w:p>
     <w:p>
@@ -3116,7 +2397,7 @@
           <w:b w:val="0"/>
           <w:sz w:val="22"/>
         </w:rPr>
-        <w:t>Tài liệu này mô tả luồng theo hành vi implement; chi tiết UI có thể tinh chỉnh theo từng form.</w:t>
+        <w:t>Hình PNG nguồn: Docs/FlowDiagrams/</w:t>
       </w:r>
     </w:p>
     <w:p>
@@ -3135,7 +2416,7 @@
     </w:p>
     <w:sectPr>
       <w:pgSz w:w="12240" w:h="15840"/>
-      <w:pgMar w:top="1134" w:right="1134" w:bottom="1134" w:left="1417" w:header="720" w:footer="720" w:gutter="0"/>
+      <w:pgMar w:top="1134" w:right="1247" w:bottom="1134" w:left="1247" w:header="720" w:footer="720" w:gutter="0"/>
       <w:cols w:space="720"/>
       <w:docGrid w:linePitch="360"/>
     </w:sectPr>

</xml_diff>